<commit_message>
Reader: section links jump within a page; a touch tap lifts where the finger was (iOS Safari)
</commit_message>
<xml_diff>
--- a/docs/starling-desktop-manual/starling-desktop-manual.docx
+++ b/docs/starling-desktop-manual/starling-desktop-manual.docx
@@ -48,6 +48,8 @@
         </w:pBdr>
         <w:spacing w:before="560" w:after="200" w:line="281" w:lineRule="auto"/>
       </w:pPr>
+      <w:bookmarkStart w:id="100001" w:name="about-this-guide"/>
+      <w:bookmarkEnd w:id="100001"/>
       <w:r>
         <w:t xml:space="preserve">About this guide</w:t>
       </w:r>
@@ -70,25 +72,15 @@
     </w:p>
     <w:p>
       <w:pPr>
-        <w:pStyle w:val="Heading1"/>
+        <w:pStyle w:val="Heading2"/>
         <w:keepNext/>
         <w:keepLines/>
-        <w:pageBreakBefore/>
-        <w:pBdr>
-          <w:bottom w:val="single" w:sz="12" w:space="6" w:color="C8102E"/>
-        </w:pBdr>
-        <w:spacing w:before="560" w:after="200" w:line="281" w:lineRule="auto"/>
-      </w:pPr>
-      <w:r>
-        <w:t xml:space="preserve">Choosing Starling at login</w:t>
-      </w:r>
-    </w:p>
-    <w:p>
-      <w:pPr>
-        <w:spacing w:after="160" w:line="259" w:lineRule="auto"/>
-      </w:pPr>
-      <w:r>
-        <w:t xml:space="preserve">Installing Starling doesn't replace your current desktop — it adds a session you pick at the login screen. To start it:</w:t>
+        <w:spacing w:before="400" w:after="120" w:line="281" w:lineRule="auto"/>
+      </w:pPr>
+      <w:bookmarkStart w:id="100002" w:name="how-this-guide-is-organised"/>
+      <w:bookmarkEnd w:id="100002"/>
+      <w:r>
+        <w:t xml:space="preserve">How this guide is organised</w:t>
       </w:r>
     </w:p>
     <w:p>
@@ -104,10 +96,32 @@
           <w:b/>
           <w:bCs/>
         </w:rPr>
-        <w:t xml:space="preserve">Click your name</w:t>
-      </w:r>
-      <w:r>
-        <w:t xml:space="preserve"> at the login screen.</w:t>
+        <w:t xml:space="preserve">Getting in</w:t>
+      </w:r>
+      <w:r>
+        <w:t xml:space="preserve"> — </w:t>
+      </w:r>
+      <w:hyperlink w:anchor="choosing-starling-at-login">
+        <w:r>
+          <w:rPr>
+            <w:rStyle w:val="Hyperlink"/>
+          </w:rPr>
+          <w:t xml:space="preserve">Choosing Starling at login</w:t>
+        </w:r>
+      </w:hyperlink>
+      <w:r>
+        <w:t xml:space="preserve"> and </w:t>
+      </w:r>
+      <w:hyperlink w:anchor="first-login">
+        <w:r>
+          <w:rPr>
+            <w:rStyle w:val="Hyperlink"/>
+          </w:rPr>
+          <w:t xml:space="preserve">First login</w:t>
+        </w:r>
+      </w:hyperlink>
+      <w:r>
+        <w:t xml:space="preserve">.</w:t>
       </w:r>
     </w:p>
     <w:p>
@@ -123,10 +137,76 @@
           <w:b/>
           <w:bCs/>
         </w:rPr>
-        <w:t xml:space="preserve">Open the session menu</w:t>
-      </w:r>
-      <w:r>
-        <w:t xml:space="preserve"> — usually a gear, or a small icon in a lower corner of the password box.</w:t>
+        <w:t xml:space="preserve">The desktop</w:t>
+      </w:r>
+      <w:r>
+        <w:t xml:space="preserve"> — </w:t>
+      </w:r>
+      <w:hyperlink w:anchor="the-dock">
+        <w:r>
+          <w:rPr>
+            <w:rStyle w:val="Hyperlink"/>
+          </w:rPr>
+          <w:t xml:space="preserve">The dock</w:t>
+        </w:r>
+      </w:hyperlink>
+      <w:r>
+        <w:t xml:space="preserve">, </w:t>
+      </w:r>
+      <w:hyperlink w:anchor="the-launchpad">
+        <w:r>
+          <w:rPr>
+            <w:rStyle w:val="Hyperlink"/>
+          </w:rPr>
+          <w:t xml:space="preserve">The Launchpad</w:t>
+        </w:r>
+      </w:hyperlink>
+      <w:r>
+        <w:t xml:space="preserve">, </w:t>
+      </w:r>
+      <w:hyperlink w:anchor="the-menu-bar">
+        <w:r>
+          <w:rPr>
+            <w:rStyle w:val="Hyperlink"/>
+          </w:rPr>
+          <w:t xml:space="preserve">The menu bar</w:t>
+        </w:r>
+      </w:hyperlink>
+      <w:r>
+        <w:t xml:space="preserve">, </w:t>
+      </w:r>
+      <w:hyperlink w:anchor="windows">
+        <w:r>
+          <w:rPr>
+            <w:rStyle w:val="Hyperlink"/>
+          </w:rPr>
+          <w:t xml:space="preserve">Windows</w:t>
+        </w:r>
+      </w:hyperlink>
+      <w:r>
+        <w:t xml:space="preserve">, </w:t>
+      </w:r>
+      <w:hyperlink w:anchor="spaces-and-mission-control">
+        <w:r>
+          <w:rPr>
+            <w:rStyle w:val="Hyperlink"/>
+          </w:rPr>
+          <w:t xml:space="preserve">Spaces and Mission Control</w:t>
+        </w:r>
+      </w:hyperlink>
+      <w:r>
+        <w:t xml:space="preserve"> and </w:t>
+      </w:r>
+      <w:hyperlink w:anchor="right-click-the-desktop">
+        <w:r>
+          <w:rPr>
+            <w:rStyle w:val="Hyperlink"/>
+          </w:rPr>
+          <w:t xml:space="preserve">Right-click the desktop</w:t>
+        </w:r>
+      </w:hyperlink>
+      <w:r>
+        <w:t xml:space="preserve">.</w:t>
       </w:r>
     </w:p>
     <w:p>
@@ -138,1015 +218,182 @@
         <w:spacing w:after="160" w:line="259" w:lineRule="auto"/>
       </w:pPr>
       <w:r>
-        <w:t xml:space="preserve">Choose </w:t>
-      </w:r>
-      <w:r>
-        <w:rPr>
-          <w:b/>
-          <w:bCs/>
-        </w:rPr>
-        <w:t xml:space="preserve">Starling</w:t>
-      </w:r>
-      <w:r>
-        <w:t xml:space="preserve"> from the list, then enter your password and sign in.</w:t>
-      </w:r>
-    </w:p>
-    <w:p>
-      <w:pPr>
-        <w:spacing w:after="160" w:line="259" w:lineRule="auto"/>
-      </w:pPr>
-      <w:r>
-        <w:t xml:space="preserve">Starling stays selected for next time. The session menu only appears with a Wayland-capable login manager (GDM has one); it looks a little different on LightDM or SDDM, but the step is the same — find the session picker and choose Starling. (See the Installation Guide if you don't see a session menu at all.)</w:t>
-      </w:r>
-    </w:p>
-    <w:p>
-      <w:pPr>
-        <w:pStyle w:val="Heading1"/>
+        <w:rPr>
+          <w:b/>
+          <w:bCs/>
+        </w:rPr>
+        <w:t xml:space="preserve">Features</w:t>
+      </w:r>
+      <w:r>
+        <w:t xml:space="preserve"> — </w:t>
+      </w:r>
+      <w:hyperlink w:anchor="recording-the-screen">
+        <w:r>
+          <w:rPr>
+            <w:rStyle w:val="Hyperlink"/>
+          </w:rPr>
+          <w:t xml:space="preserve">Recording the screen</w:t>
+        </w:r>
+      </w:hyperlink>
+      <w:r>
+        <w:t xml:space="preserve">, </w:t>
+      </w:r>
+      <w:hyperlink w:anchor="the-screensaver">
+        <w:r>
+          <w:rPr>
+            <w:rStyle w:val="Hyperlink"/>
+          </w:rPr>
+          <w:t xml:space="preserve">The screensaver</w:t>
+        </w:r>
+      </w:hyperlink>
+      <w:r>
+        <w:t xml:space="preserve"> and </w:t>
+      </w:r>
+      <w:hyperlink w:anchor="workspaces-a-desktop-for-your-agent">
+        <w:r>
+          <w:rPr>
+            <w:rStyle w:val="Hyperlink"/>
+          </w:rPr>
+          <w:t xml:space="preserve">Workspaces</w:t>
+        </w:r>
+      </w:hyperlink>
+      <w:r>
+        <w:t xml:space="preserve">.</w:t>
+      </w:r>
+    </w:p>
+    <w:p>
+      <w:pPr>
+        <w:numPr>
+          <w:ilvl w:val="0"/>
+          <w:numId w:val="3"/>
+        </w:numPr>
+        <w:spacing w:after="160" w:line="259" w:lineRule="auto"/>
+      </w:pPr>
+      <w:r>
+        <w:rPr>
+          <w:b/>
+          <w:bCs/>
+        </w:rPr>
+        <w:t xml:space="preserve">Reference</w:t>
+      </w:r>
+      <w:r>
+        <w:t xml:space="preserve"> — </w:t>
+      </w:r>
+      <w:hyperlink w:anchor="keyboard-shortcuts">
+        <w:r>
+          <w:rPr>
+            <w:rStyle w:val="Hyperlink"/>
+          </w:rPr>
+          <w:t xml:space="preserve">Keyboard shortcuts</w:t>
+        </w:r>
+      </w:hyperlink>
+      <w:r>
+        <w:t xml:space="preserve">, </w:t>
+      </w:r>
+      <w:hyperlink w:anchor="the-apps">
+        <w:r>
+          <w:rPr>
+            <w:rStyle w:val="Hyperlink"/>
+          </w:rPr>
+          <w:t xml:space="preserve">The apps</w:t>
+        </w:r>
+      </w:hyperlink>
+      <w:r>
+        <w:t xml:space="preserve">, </w:t>
+      </w:r>
+      <w:hyperlink w:anchor="settings">
+        <w:r>
+          <w:rPr>
+            <w:rStyle w:val="Hyperlink"/>
+          </w:rPr>
+          <w:t xml:space="preserve">Settings</w:t>
+        </w:r>
+      </w:hyperlink>
+      <w:r>
+        <w:t xml:space="preserve"> and </w:t>
+      </w:r>
+      <w:hyperlink w:anchor="installing-more-apps">
+        <w:r>
+          <w:rPr>
+            <w:rStyle w:val="Hyperlink"/>
+          </w:rPr>
+          <w:t xml:space="preserve">Installing more apps</w:t>
+        </w:r>
+      </w:hyperlink>
+      <w:r>
+        <w:t xml:space="preserve">.</w:t>
+      </w:r>
+    </w:p>
+    <w:p>
+      <w:pPr>
+        <w:numPr>
+          <w:ilvl w:val="0"/>
+          <w:numId w:val="3"/>
+        </w:numPr>
+        <w:spacing w:after="160" w:line="259" w:lineRule="auto"/>
+      </w:pPr>
+      <w:r>
+        <w:rPr>
+          <w:b/>
+          <w:bCs/>
+        </w:rPr>
+        <w:t xml:space="preserve">When something is off</w:t>
+      </w:r>
+      <w:r>
+        <w:t xml:space="preserve"> — </w:t>
+      </w:r>
+      <w:hyperlink w:anchor="things-to-know-in-this-release">
+        <w:r>
+          <w:rPr>
+            <w:rStyle w:val="Hyperlink"/>
+          </w:rPr>
+          <w:t xml:space="preserve">Things to know in this release</w:t>
+        </w:r>
+      </w:hyperlink>
+      <w:r>
+        <w:t xml:space="preserve"> and </w:t>
+      </w:r>
+      <w:hyperlink w:anchor="when-the-terminal-draws-the-wrong-thing">
+        <w:r>
+          <w:rPr>
+            <w:rStyle w:val="Hyperlink"/>
+          </w:rPr>
+          <w:t xml:space="preserve">When the terminal draws the wrong thing</w:t>
+        </w:r>
+      </w:hyperlink>
+      <w:r>
+        <w:t xml:space="preserve">.</w:t>
+      </w:r>
+    </w:p>
+    <w:p>
+      <w:pPr>
+        <w:spacing w:after="160" w:line="259" w:lineRule="auto"/>
+      </w:pPr>
+      <w:r>
+        <w:t xml:space="preserve">Every section name in this guide is a link: tap it to jump there, and use </w:t>
+      </w:r>
+      <w:r>
+        <w:rPr>
+          <w:b/>
+          <w:bCs/>
+        </w:rPr>
+        <w:t xml:space="preserve">Contents</w:t>
+      </w:r>
+      <w:r>
+        <w:t xml:space="preserve"> to come back.</w:t>
+      </w:r>
+    </w:p>
+    <w:p>
+      <w:pPr>
+        <w:pStyle w:val="Heading2"/>
         <w:keepNext/>
         <w:keepLines/>
-        <w:pageBreakBefore/>
-        <w:pBdr>
-          <w:bottom w:val="single" w:sz="12" w:space="6" w:color="C8102E"/>
-        </w:pBdr>
-        <w:spacing w:before="560" w:after="200" w:line="281" w:lineRule="auto"/>
-      </w:pPr>
-      <w:r>
-        <w:t xml:space="preserve">First login</w:t>
-      </w:r>
-    </w:p>
-    <w:p>
-      <w:pPr>
-        <w:spacing w:after="160" w:line="259" w:lineRule="auto"/>
-      </w:pPr>
-      <w:r>
-        <w:t xml:space="preserve">Once you sign in, you land on the desktop:</w:t>
-      </w:r>
-    </w:p>
-    <w:p>
-      <w:pPr>
-        <w:numPr>
-          <w:ilvl w:val="0"/>
-          <w:numId w:val="1"/>
-        </w:numPr>
-        <w:spacing w:after="160" w:line="259" w:lineRule="auto"/>
-      </w:pPr>
-      <w:r>
-        <w:t xml:space="preserve">a </w:t>
-      </w:r>
-      <w:r>
-        <w:rPr>
-          <w:b/>
-          <w:bCs/>
-        </w:rPr>
-        <w:t xml:space="preserve">wallpaper</w:t>
-      </w:r>
-      <w:r>
-        <w:t xml:space="preserve"> filling the screen,</w:t>
-      </w:r>
-    </w:p>
-    <w:p>
-      <w:pPr>
-        <w:numPr>
-          <w:ilvl w:val="0"/>
-          <w:numId w:val="1"/>
-        </w:numPr>
-        <w:spacing w:after="160" w:line="259" w:lineRule="auto"/>
-      </w:pPr>
-      <w:r>
-        <w:t xml:space="preserve">a thin </w:t>
-      </w:r>
-      <w:r>
-        <w:rPr>
-          <w:b/>
-          <w:bCs/>
-        </w:rPr>
-        <w:t xml:space="preserve">menu bar</w:t>
-      </w:r>
-      <w:r>
-        <w:t xml:space="preserve"> across the top, with the clock and status indicators,</w:t>
-      </w:r>
-    </w:p>
-    <w:p>
-      <w:pPr>
-        <w:numPr>
-          <w:ilvl w:val="0"/>
-          <w:numId w:val="1"/>
-        </w:numPr>
-        <w:spacing w:after="160" w:line="259" w:lineRule="auto"/>
-      </w:pPr>
-      <w:r>
-        <w:t xml:space="preserve">a </w:t>
-      </w:r>
-      <w:r>
-        <w:rPr>
-          <w:b/>
-          <w:bCs/>
-        </w:rPr>
-        <w:t xml:space="preserve">dock</w:t>
-      </w:r>
-      <w:r>
-        <w:t xml:space="preserve"> floating at the bottom, holding your apps.</w:t>
-      </w:r>
-    </w:p>
-    <w:p>
-      <w:pPr>
-        <w:spacing w:after="160" w:line="259" w:lineRule="auto"/>
-      </w:pPr>
-      <w:r>
-        <w:t xml:space="preserve">That is the whole desktop. Everything else is reached from the dock, the Launchpad, or a right-click on the wallpaper.</w:t>
-      </w:r>
-    </w:p>
-    <w:p>
-      <w:pPr>
-        <w:pStyle w:val="Heading1"/>
-        <w:keepNext/>
-        <w:keepLines/>
-        <w:pageBreakBefore/>
-        <w:pBdr>
-          <w:bottom w:val="single" w:sz="12" w:space="6" w:color="C8102E"/>
-        </w:pBdr>
-        <w:spacing w:before="560" w:after="200" w:line="281" w:lineRule="auto"/>
-      </w:pPr>
-      <w:r>
-        <w:t xml:space="preserve">The dock</w:t>
-      </w:r>
-    </w:p>
-    <w:p>
-      <w:pPr>
-        <w:pageBreakBefore/>
-        <w:spacing w:after="160" w:line="259" w:lineRule="auto"/>
-      </w:pPr>
-      <w:r>
-        <w:t xml:space="preserve">The dock sits at the bottom of the screen. Out of the box it holds the first-party apps, in order: </w:t>
-      </w:r>
-      <w:r>
-        <w:rPr>
-          <w:b/>
-          <w:bCs/>
-        </w:rPr>
-        <w:t xml:space="preserve">Launchpad</w:t>
-      </w:r>
-      <w:r>
-        <w:t xml:space="preserve">, </w:t>
-      </w:r>
-      <w:r>
-        <w:rPr>
-          <w:b/>
-          <w:bCs/>
-        </w:rPr>
-        <w:t xml:space="preserve">Settings</w:t>
-      </w:r>
-      <w:r>
-        <w:t xml:space="preserve">, </w:t>
-      </w:r>
-      <w:r>
-        <w:rPr>
-          <w:b/>
-          <w:bCs/>
-        </w:rPr>
-        <w:t xml:space="preserve">Files</w:t>
-      </w:r>
-      <w:r>
-        <w:t xml:space="preserve">, </w:t>
-      </w:r>
-      <w:r>
-        <w:rPr>
-          <w:b/>
-          <w:bCs/>
-        </w:rPr>
-        <w:t xml:space="preserve">Terminal</w:t>
-      </w:r>
-      <w:r>
-        <w:t xml:space="preserve">, </w:t>
-      </w:r>
-      <w:r>
-        <w:rPr>
-          <w:b/>
-          <w:bCs/>
-        </w:rPr>
-        <w:t xml:space="preserve">Text Editor</w:t>
-      </w:r>
-      <w:r>
-        <w:t xml:space="preserve">, </w:t>
-      </w:r>
-      <w:r>
-        <w:rPr>
-          <w:b/>
-          <w:bCs/>
-        </w:rPr>
-        <w:t xml:space="preserve">Calculator</w:t>
-      </w:r>
-      <w:r>
-        <w:t xml:space="preserve">, </w:t>
-      </w:r>
-      <w:r>
-        <w:rPr>
-          <w:b/>
-          <w:bCs/>
-        </w:rPr>
-        <w:t xml:space="preserve">App Store</w:t>
-      </w:r>
-      <w:r>
-        <w:t xml:space="preserve">, </w:t>
-      </w:r>
-      <w:r>
-        <w:rPr>
-          <w:b/>
-          <w:bCs/>
-        </w:rPr>
-        <w:t xml:space="preserve">Video Player</w:t>
-      </w:r>
-      <w:r>
-        <w:t xml:space="preserve">.</w:t>
-      </w:r>
-    </w:p>
-    <w:p>
-      <w:pPr>
-        <w:numPr>
-          <w:ilvl w:val="0"/>
-          <w:numId w:val="1"/>
-        </w:numPr>
-        <w:spacing w:after="160" w:line="259" w:lineRule="auto"/>
-      </w:pPr>
-      <w:r>
-        <w:rPr>
-          <w:b/>
-          <w:bCs/>
-        </w:rPr>
-        <w:t xml:space="preserve">Click</w:t>
-      </w:r>
-      <w:r>
-        <w:t xml:space="preserve"> an icon to launch or focus that app.</w:t>
-      </w:r>
-    </w:p>
-    <w:p>
-      <w:pPr>
-        <w:numPr>
-          <w:ilvl w:val="0"/>
-          <w:numId w:val="1"/>
-        </w:numPr>
-        <w:spacing w:after="160" w:line="259" w:lineRule="auto"/>
-      </w:pPr>
-      <w:r>
-        <w:t xml:space="preserve">A </w:t>
-      </w:r>
-      <w:r>
-        <w:rPr>
-          <w:b/>
-          <w:bCs/>
-        </w:rPr>
-        <w:t xml:space="preserve">running app shows an indicator</w:t>
-      </w:r>
-      <w:r>
-        <w:t xml:space="preserve"> under its icon.</w:t>
-      </w:r>
-    </w:p>
-    <w:p>
-      <w:pPr>
-        <w:numPr>
-          <w:ilvl w:val="0"/>
-          <w:numId w:val="1"/>
-        </w:numPr>
-        <w:spacing w:after="160" w:line="259" w:lineRule="auto"/>
-      </w:pPr>
-      <w:r>
-        <w:rPr>
-          <w:b/>
-          <w:bCs/>
-        </w:rPr>
-        <w:t xml:space="preserve">Drag</w:t>
-      </w:r>
-      <w:r>
-        <w:t xml:space="preserve"> an icon to reorder the dock.</w:t>
-      </w:r>
-    </w:p>
-    <w:p>
-      <w:pPr>
-        <w:numPr>
-          <w:ilvl w:val="0"/>
-          <w:numId w:val="1"/>
-        </w:numPr>
-        <w:spacing w:after="160" w:line="259" w:lineRule="auto"/>
-      </w:pPr>
-      <w:r>
-        <w:rPr>
-          <w:b/>
-          <w:bCs/>
-        </w:rPr>
-        <w:t xml:space="preserve">Right-click</w:t>
-      </w:r>
-      <w:r>
-        <w:t xml:space="preserve"> an icon for its menu, including </w:t>
-      </w:r>
-      <w:r>
-        <w:rPr>
-          <w:b/>
-          <w:bCs/>
-        </w:rPr>
-        <w:t xml:space="preserve">Remove from Dock</w:t>
-      </w:r>
-      <w:r>
-        <w:t xml:space="preserve">.</w:t>
-      </w:r>
-    </w:p>
-    <w:p>
-      <w:pPr>
-        <w:spacing w:after="160" w:line="259" w:lineRule="auto"/>
-      </w:pPr>
-      <w:r>
-        <w:t xml:space="preserve">Installed apps that aren't pinned appear in the dock while they run, and drop off when they close.</w:t>
-      </w:r>
-    </w:p>
-    <w:p>
-      <w:pPr>
-        <w:pStyle w:val="Heading1"/>
-        <w:keepNext/>
-        <w:keepLines/>
-        <w:pageBreakBefore/>
-        <w:pBdr>
-          <w:bottom w:val="single" w:sz="12" w:space="6" w:color="C8102E"/>
-        </w:pBdr>
-        <w:spacing w:before="560" w:after="200" w:line="281" w:lineRule="auto"/>
-      </w:pPr>
-      <w:r>
-        <w:t xml:space="preserve">The Launchpad</w:t>
-      </w:r>
-    </w:p>
-    <w:p>
-      <w:pPr>
-        <w:pageBreakBefore/>
-        <w:spacing w:after="160" w:line="259" w:lineRule="auto"/>
-      </w:pPr>
-      <w:r>
-        <w:t xml:space="preserve">The first dock icon opens the </w:t>
-      </w:r>
-      <w:r>
-        <w:rPr>
-          <w:b/>
-          <w:bCs/>
-        </w:rPr>
-        <w:t xml:space="preserve">Launchpad</w:t>
-      </w:r>
-      <w:r>
-        <w:t xml:space="preserve"> — a full-screen grid of every app Starling knows about, over a blurred background.</w:t>
-      </w:r>
-    </w:p>
-    <w:p>
-      <w:pPr>
-        <w:numPr>
-          <w:ilvl w:val="0"/>
-          <w:numId w:val="1"/>
-        </w:numPr>
-        <w:spacing w:after="160" w:line="259" w:lineRule="auto"/>
-      </w:pPr>
-      <w:r>
-        <w:rPr>
-          <w:b/>
-          <w:bCs/>
-        </w:rPr>
-        <w:t xml:space="preserve">Click</w:t>
-      </w:r>
-      <w:r>
-        <w:t xml:space="preserve"> any app to launch it.</w:t>
-      </w:r>
-    </w:p>
-    <w:p>
-      <w:pPr>
-        <w:numPr>
-          <w:ilvl w:val="0"/>
-          <w:numId w:val="1"/>
-        </w:numPr>
-        <w:spacing w:after="160" w:line="259" w:lineRule="auto"/>
-      </w:pPr>
-      <w:r>
-        <w:rPr>
-          <w:b/>
-          <w:bCs/>
-        </w:rPr>
-        <w:t xml:space="preserve">Type</w:t>
-      </w:r>
-      <w:r>
-        <w:t xml:space="preserve"> to filter the grid by name — start typing and only matching apps remain.</w:t>
-      </w:r>
-    </w:p>
-    <w:p>
-      <w:pPr>
-        <w:numPr>
-          <w:ilvl w:val="0"/>
-          <w:numId w:val="1"/>
-        </w:numPr>
-        <w:spacing w:after="160" w:line="259" w:lineRule="auto"/>
-      </w:pPr>
-      <w:r>
-        <w:t xml:space="preserve">Click empty space or press </w:t>
-      </w:r>
-      <w:r>
-        <w:rPr>
-          <w:b/>
-          <w:bCs/>
-        </w:rPr>
-        <w:t xml:space="preserve">Esc</w:t>
-      </w:r>
-      <w:r>
-        <w:t xml:space="preserve"> to dismiss it.</w:t>
-      </w:r>
-    </w:p>
-    <w:p>
-      <w:pPr>
-        <w:pStyle w:val="Heading1"/>
-        <w:keepNext/>
-        <w:keepLines/>
-        <w:pageBreakBefore/>
-        <w:pBdr>
-          <w:bottom w:val="single" w:sz="12" w:space="6" w:color="C8102E"/>
-        </w:pBdr>
-        <w:spacing w:before="560" w:after="200" w:line="281" w:lineRule="auto"/>
-      </w:pPr>
-      <w:r>
-        <w:t xml:space="preserve">The menu bar</w:t>
-      </w:r>
-    </w:p>
-    <w:p>
-      <w:pPr>
-        <w:pageBreakBefore/>
-        <w:spacing w:after="160" w:line="259" w:lineRule="auto"/>
-      </w:pPr>
-      <w:r>
-        <w:t xml:space="preserve">The bar along the top carries the clock and date on the left, and on the right the Wi-Fi and battery indicators, a </w:t>
-      </w:r>
-      <w:r>
-        <w:rPr>
-          <w:b/>
-          <w:bCs/>
-        </w:rPr>
-        <w:t xml:space="preserve">bell</w:t>
-      </w:r>
-      <w:r>
-        <w:t xml:space="preserve">, and the </w:t>
-      </w:r>
-      <w:r>
-        <w:rPr>
-          <w:b/>
-          <w:bCs/>
-        </w:rPr>
-        <w:t xml:space="preserve">control centre</w:t>
-      </w:r>
-      <w:r>
-        <w:t xml:space="preserve">.</w:t>
-      </w:r>
-    </w:p>
-    <w:p>
-      <w:pPr>
-        <w:spacing w:after="160" w:line="259" w:lineRule="auto"/>
-      </w:pPr>
-      <w:r>
-        <w:t xml:space="preserve">Click the control-centre icon for a panel of quick toggles:</w:t>
-      </w:r>
-    </w:p>
-    <w:p>
-      <w:pPr>
-        <w:numPr>
-          <w:ilvl w:val="0"/>
-          <w:numId w:val="1"/>
-        </w:numPr>
-        <w:spacing w:after="160" w:line="259" w:lineRule="auto"/>
-      </w:pPr>
-      <w:r>
-        <w:rPr>
-          <w:b/>
-          <w:bCs/>
-        </w:rPr>
-        <w:t xml:space="preserve">Wi-Fi</w:t>
-      </w:r>
-      <w:r>
-        <w:t xml:space="preserve"> — join a network without opening Settings.</w:t>
-      </w:r>
-    </w:p>
-    <w:p>
-      <w:pPr>
-        <w:numPr>
-          <w:ilvl w:val="0"/>
-          <w:numId w:val="1"/>
-        </w:numPr>
-        <w:spacing w:after="160" w:line="259" w:lineRule="auto"/>
-      </w:pPr>
-      <w:r>
-        <w:rPr>
-          <w:b/>
-          <w:bCs/>
-        </w:rPr>
-        <w:t xml:space="preserve">Dark Mode</w:t>
-      </w:r>
-      <w:r>
-        <w:t xml:space="preserve"> — switches the whole desktop and every first-party app.</w:t>
-      </w:r>
-    </w:p>
-    <w:p>
-      <w:pPr>
-        <w:numPr>
-          <w:ilvl w:val="0"/>
-          <w:numId w:val="1"/>
-        </w:numPr>
-        <w:spacing w:after="160" w:line="259" w:lineRule="auto"/>
-      </w:pPr>
-      <w:r>
-        <w:rPr>
-          <w:b/>
-          <w:bCs/>
-        </w:rPr>
-        <w:t xml:space="preserve">Tiling</w:t>
-      </w:r>
-      <w:r>
-        <w:t xml:space="preserve"> — retiles the current space; toggle it off to restore floating windows.</w:t>
-      </w:r>
-    </w:p>
-    <w:p>
-      <w:pPr>
-        <w:numPr>
-          <w:ilvl w:val="0"/>
-          <w:numId w:val="1"/>
-        </w:numPr>
-        <w:spacing w:after="160" w:line="259" w:lineRule="auto"/>
-      </w:pPr>
-      <w:r>
-        <w:rPr>
-          <w:b/>
-          <w:bCs/>
-        </w:rPr>
-        <w:t xml:space="preserve">Muted</w:t>
-      </w:r>
-      <w:r>
-        <w:t xml:space="preserve"> — mute or unmute output, with </w:t>
-      </w:r>
-      <w:r>
-        <w:rPr>
-          <w:b/>
-          <w:bCs/>
-        </w:rPr>
-        <w:t xml:space="preserve">volume</w:t>
-      </w:r>
-      <w:r>
-        <w:t xml:space="preserve"> and </w:t>
-      </w:r>
-      <w:r>
-        <w:rPr>
-          <w:b/>
-          <w:bCs/>
-        </w:rPr>
-        <w:t xml:space="preserve">brightness</w:t>
-      </w:r>
-      <w:r>
-        <w:t xml:space="preserve"> sliders below the tiles.</w:t>
-      </w:r>
-    </w:p>
-    <w:p>
-      <w:pPr>
-        <w:numPr>
-          <w:ilvl w:val="0"/>
-          <w:numId w:val="1"/>
-        </w:numPr>
-        <w:spacing w:after="160" w:line="259" w:lineRule="auto"/>
-      </w:pPr>
-      <w:r>
-        <w:rPr>
-          <w:b/>
-          <w:bCs/>
-        </w:rPr>
-        <w:t xml:space="preserve">Record</w:t>
-      </w:r>
-      <w:r>
-        <w:t xml:space="preserve"> and </w:t>
-      </w:r>
-      <w:r>
-        <w:rPr>
-          <w:b/>
-          <w:bCs/>
-        </w:rPr>
-        <w:t xml:space="preserve">Record App</w:t>
-      </w:r>
-      <w:r>
-        <w:t xml:space="preserve"> — see Recording the screen.</w:t>
-      </w:r>
-    </w:p>
-    <w:p>
-      <w:pPr>
-        <w:spacing w:after="160" w:line="259" w:lineRule="auto"/>
-      </w:pPr>
-      <w:r>
-        <w:t xml:space="preserve">The </w:t>
-      </w:r>
-      <w:r>
-        <w:rPr>
-          <w:b/>
-          <w:bCs/>
-        </w:rPr>
-        <w:t xml:space="preserve">bell</w:t>
-      </w:r>
-      <w:r>
-        <w:t xml:space="preserve"> collects notifications instead of interrupting you with banners: nothing steals focus, and you read what happened when you choose to. Click it for the list, </w:t>
-      </w:r>
-      <w:r>
-        <w:rPr>
-          <w:b/>
-          <w:bCs/>
-        </w:rPr>
-        <w:t xml:space="preserve">Esc</w:t>
-      </w:r>
-      <w:r>
-        <w:t xml:space="preserve"> to dismiss.</w:t>
-      </w:r>
-    </w:p>
-    <w:p>
-      <w:pPr>
-        <w:pStyle w:val="Heading1"/>
-        <w:keepNext/>
-        <w:keepLines/>
-        <w:pageBreakBefore/>
-        <w:pBdr>
-          <w:bottom w:val="single" w:sz="12" w:space="6" w:color="C8102E"/>
-        </w:pBdr>
-        <w:spacing w:before="560" w:after="200" w:line="281" w:lineRule="auto"/>
-      </w:pPr>
-      <w:r>
-        <w:t xml:space="preserve">Recording the screen</w:t>
-      </w:r>
-    </w:p>
-    <w:p>
-      <w:pPr>
-        <w:pageBreakBefore/>
-        <w:spacing w:after="160" w:line="259" w:lineRule="auto"/>
-      </w:pPr>
-      <w:r>
-        <w:t xml:space="preserve">Starling records itself, with no extra software.</w:t>
-      </w:r>
-    </w:p>
-    <w:p>
-      <w:pPr>
-        <w:numPr>
-          <w:ilvl w:val="0"/>
-          <w:numId w:val="1"/>
-        </w:numPr>
-        <w:spacing w:after="160" w:line="259" w:lineRule="auto"/>
-      </w:pPr>
-      <w:r>
-        <w:rPr>
-          <w:b/>
-          <w:bCs/>
-        </w:rPr>
-        <w:t xml:space="preserve">Record</w:t>
-      </w:r>
-      <w:r>
-        <w:t xml:space="preserve"> (control centre, or </w:t>
-      </w:r>
-      <w:r>
-        <w:rPr>
-          <w:b/>
-          <w:bCs/>
-        </w:rPr>
-        <w:t xml:space="preserve">Ctrl + Shift + R</w:t>
-      </w:r>
-      <w:r>
-        <w:t xml:space="preserve">) captures the whole screen.</w:t>
-      </w:r>
-    </w:p>
-    <w:p>
-      <w:pPr>
-        <w:numPr>
-          <w:ilvl w:val="0"/>
-          <w:numId w:val="1"/>
-        </w:numPr>
-        <w:spacing w:after="160" w:line="259" w:lineRule="auto"/>
-      </w:pPr>
-      <w:r>
-        <w:rPr>
-          <w:b/>
-          <w:bCs/>
-        </w:rPr>
-        <w:t xml:space="preserve">Record App</w:t>
-      </w:r>
-      <w:r>
-        <w:t xml:space="preserve"> opens Mission Control and asks which window you want. It captures that window's own content, not the region of screen it sits in, so windows stacked on top never appear and moving or resizing the window mid-recording doesn't spoil the take. The pointer is drawn in and follows the window.</w:t>
-      </w:r>
-    </w:p>
-    <w:p>
-      <w:pPr>
-        <w:spacing w:after="160" w:line="259" w:lineRule="auto"/>
-      </w:pPr>
-      <w:r>
-        <w:t xml:space="preserve">While a recording runs, a </w:t>
-      </w:r>
-      <w:r>
-        <w:rPr>
-          <w:b/>
-          <w:bCs/>
-        </w:rPr>
-        <w:t xml:space="preserve">red dot and a running clock</w:t>
-      </w:r>
-      <w:r>
-        <w:t xml:space="preserve"> sit in the menu bar, so a recording can never be going unnoticed. Stop it the same way you started it.</w:t>
-      </w:r>
-    </w:p>
-    <w:p>
-      <w:pPr>
-        <w:spacing w:after="160" w:line="259" w:lineRule="auto"/>
-      </w:pPr>
-      <w:r>
-        <w:t xml:space="preserve">Recordings land in </w:t>
-      </w:r>
-      <w:r>
-        <w:rPr>
-          <w:rFonts w:ascii="Liberation Mono" w:hAnsi="Liberation Mono" w:cs="Liberation Mono"/>
-          <w:b/>
-          <w:bCs/>
-        </w:rPr>
-        <w:t xml:space="preserve">~/Videos</w:t>
-      </w:r>
-      <w:r>
-        <w:t xml:space="preserve"> as MP4, and the Video Player opens them. Where the machine has a hardware H.264 encoder, the frame the compositor already drew goes straight to it as a dma-buf and the CPU never touches a pixel — on a modern laptop that costs about 0.05 of a core. Machines without one fall back to a software encoder, which works but costs more.</w:t>
-      </w:r>
-    </w:p>
-    <w:p>
-      <w:pPr>
-        <w:pStyle w:val="Heading1"/>
-        <w:keepNext/>
-        <w:keepLines/>
-        <w:pageBreakBefore/>
-        <w:pBdr>
-          <w:bottom w:val="single" w:sz="12" w:space="6" w:color="C8102E"/>
-        </w:pBdr>
-        <w:spacing w:before="560" w:after="200" w:line="281" w:lineRule="auto"/>
-      </w:pPr>
-      <w:r>
-        <w:t xml:space="preserve">The screensaver</w:t>
-      </w:r>
-    </w:p>
-    <w:p>
-      <w:pPr>
-        <w:pageBreakBefore/>
-        <w:spacing w:after="160" w:line="259" w:lineRule="auto"/>
-      </w:pPr>
-      <w:r>
-        <w:t xml:space="preserve">Leave the desk for ten minutes and the desktop dissolves into a screensaver: your own screen, blurred and drifting behind a slow liquid warp, with the time and date floating over it. Any key, click, or mouse movement brings it straight back — nothing is asked for, so it is decoration, not a lock. </w:t>
-      </w:r>
-      <w:r>
-        <w:rPr>
-          <w:b/>
-          <w:bCs/>
-        </w:rPr>
-        <w:t xml:space="preserve">Ctrl + Shift + S</w:t>
-      </w:r>
-      <w:r>
-        <w:t xml:space="preserve"> shows it immediately.</w:t>
-      </w:r>
-    </w:p>
-    <w:p>
-      <w:pPr>
-        <w:spacing w:after="160" w:line="259" w:lineRule="auto"/>
-      </w:pPr>
-      <w:r>
-        <w:t xml:space="preserve">Change the idle time (or turn it off) in </w:t>
-      </w:r>
-      <w:r>
-        <w:rPr>
-          <w:b/>
-          <w:bCs/>
-        </w:rPr>
-        <w:t xml:space="preserve">Settings → Appearance → Screensaver</w:t>
-      </w:r>
-      <w:r>
-        <w:t xml:space="preserve">. Video playback holds it off: an app that tells the desktop it is playing something — Chrome, Firefox, a video player — keeps the screensaver away for as long as it says so, so a film watched without touching the mouse is never interrupted.</w:t>
-      </w:r>
-    </w:p>
-    <w:p>
-      <w:pPr>
-        <w:spacing w:after="160" w:line="259" w:lineRule="auto"/>
-      </w:pPr>
-      <w:r>
-        <w:t xml:space="preserve">For </w:t>
-      </w:r>
-      <w:r>
-        <w:rPr>
-          <w:b/>
-          <w:bCs/>
-        </w:rPr>
-        <w:t xml:space="preserve">aerial footage</w:t>
-      </w:r>
-      <w:r>
-        <w:t xml:space="preserve"> in place of the warp, drop a video file in </w:t>
-      </w:r>
-      <w:r>
-        <w:rPr>
-          <w:rFonts w:ascii="Liberation Mono" w:hAnsi="Liberation Mono" w:cs="Liberation Mono"/>
-        </w:rPr>
-        <w:t xml:space="preserve">~/.local/share/starling/aerials/</w:t>
-      </w:r>
-      <w:r>
-        <w:t xml:space="preserve">; the screensaver dissolves into it and loops it. Starling ships none of its own — the warp needs no assets, and the clips worth watching are large. Any shape works: letterbox bars are cropped away and the picture fills the screen.</w:t>
-      </w:r>
-    </w:p>
-    <w:p>
-      <w:pPr>
-        <w:pStyle w:val="Heading1"/>
-        <w:keepNext/>
-        <w:keepLines/>
-        <w:pageBreakBefore/>
-        <w:pBdr>
-          <w:bottom w:val="single" w:sz="12" w:space="6" w:color="C8102E"/>
-        </w:pBdr>
-        <w:spacing w:before="560" w:after="200" w:line="281" w:lineRule="auto"/>
-      </w:pPr>
-      <w:r>
-        <w:t xml:space="preserve">Windows</w:t>
-      </w:r>
-    </w:p>
-    <w:p>
-      <w:pPr>
-        <w:pageBreakBefore/>
-        <w:spacing w:after="160" w:line="259" w:lineRule="auto"/>
-      </w:pPr>
-      <w:r>
-        <w:t xml:space="preserve">Windows have a title bar with three </w:t>
-      </w:r>
-      <w:r>
-        <w:rPr>
-          <w:b/>
-          <w:bCs/>
-        </w:rPr>
-        <w:t xml:space="preserve">macOS-style colored circle buttons</w:t>
-      </w:r>
-      <w:r>
-        <w:t xml:space="preserve"> on the left — close, minimize, maximize.</w:t>
-      </w:r>
-    </w:p>
-    <w:p>
-      <w:pPr>
-        <w:numPr>
-          <w:ilvl w:val="0"/>
-          <w:numId w:val="1"/>
-        </w:numPr>
-        <w:spacing w:after="160" w:line="259" w:lineRule="auto"/>
-      </w:pPr>
-      <w:r>
-        <w:rPr>
-          <w:b/>
-          <w:bCs/>
-        </w:rPr>
-        <w:t xml:space="preserve">Drag the title bar</w:t>
-      </w:r>
-      <w:r>
-        <w:t xml:space="preserve"> to move a window.</w:t>
-      </w:r>
-    </w:p>
-    <w:p>
-      <w:pPr>
-        <w:numPr>
-          <w:ilvl w:val="0"/>
-          <w:numId w:val="1"/>
-        </w:numPr>
-        <w:spacing w:after="160" w:line="259" w:lineRule="auto"/>
-      </w:pPr>
-      <w:r>
-        <w:rPr>
-          <w:b/>
-          <w:bCs/>
-        </w:rPr>
-        <w:t xml:space="preserve">Drag an edge or corner</w:t>
-      </w:r>
-      <w:r>
-        <w:t xml:space="preserve"> to resize it.</w:t>
-      </w:r>
-    </w:p>
-    <w:p>
-      <w:pPr>
-        <w:numPr>
-          <w:ilvl w:val="0"/>
-          <w:numId w:val="1"/>
-        </w:numPr>
-        <w:spacing w:after="160" w:line="259" w:lineRule="auto"/>
-      </w:pPr>
-      <w:r>
-        <w:rPr>
-          <w:b/>
-          <w:bCs/>
-        </w:rPr>
-        <w:t xml:space="preserve">Double-click the title bar</w:t>
-      </w:r>
-      <w:r>
-        <w:t xml:space="preserve"> to toggle maximized.</w:t>
-      </w:r>
-    </w:p>
-    <w:p>
-      <w:pPr>
-        <w:numPr>
-          <w:ilvl w:val="0"/>
-          <w:numId w:val="1"/>
-        </w:numPr>
-        <w:spacing w:after="160" w:line="259" w:lineRule="auto"/>
-      </w:pPr>
-      <w:r>
-        <w:t xml:space="preserve">The </w:t>
-      </w:r>
-      <w:r>
-        <w:rPr>
-          <w:b/>
-          <w:bCs/>
-        </w:rPr>
-        <w:t xml:space="preserve">maximize</w:t>
-      </w:r>
-      <w:r>
-        <w:t xml:space="preserve"> button does the same.</w:t>
-      </w:r>
-    </w:p>
-    <w:p>
-      <w:pPr>
-        <w:spacing w:after="160" w:line="259" w:lineRule="auto"/>
-      </w:pPr>
-      <w:r>
-        <w:t xml:space="preserve">By default windows </w:t>
-      </w:r>
-      <w:r>
-        <w:rPr>
-          <w:b/>
-          <w:bCs/>
-        </w:rPr>
-        <w:t xml:space="preserve">float</w:t>
-      </w:r>
-      <w:r>
-        <w:t xml:space="preserve"> — you place them freely. You can switch the whole desktop to </w:t>
-      </w:r>
-      <w:r>
-        <w:rPr>
-          <w:b/>
-          <w:bCs/>
-        </w:rPr>
-        <w:t xml:space="preserve">tiling</w:t>
-      </w:r>
-      <w:r>
-        <w:t xml:space="preserve"> (a dwm-style master-and-stack layout, where windows share the screen automatically) with the </w:t>
-      </w:r>
-      <w:r>
-        <w:rPr>
-          <w:b/>
-          <w:bCs/>
-        </w:rPr>
-        <w:t xml:space="preserve">Tiling</w:t>
-      </w:r>
-      <w:r>
-        <w:t xml:space="preserve"> tile in the control centre, or the </w:t>
-      </w:r>
-      <w:r>
-        <w:rPr>
-          <w:b/>
-          <w:bCs/>
-        </w:rPr>
-        <w:t xml:space="preserve">Tiling Windows</w:t>
-      </w:r>
-      <w:r>
-        <w:t xml:space="preserve"> switch in Settings. Toggling it back restores your floating layout.</w:t>
-      </w:r>
-    </w:p>
-    <w:p>
-      <w:pPr>
-        <w:pStyle w:val="Heading1"/>
-        <w:keepNext/>
-        <w:keepLines/>
-        <w:pageBreakBefore/>
-        <w:pBdr>
-          <w:bottom w:val="single" w:sz="12" w:space="6" w:color="C8102E"/>
-        </w:pBdr>
-        <w:spacing w:before="560" w:after="200" w:line="281" w:lineRule="auto"/>
-      </w:pPr>
-      <w:r>
-        <w:t xml:space="preserve">Spaces and Mission Control</w:t>
-      </w:r>
-    </w:p>
-    <w:p>
-      <w:pPr>
-        <w:pageBreakBefore/>
-        <w:spacing w:after="160" w:line="259" w:lineRule="auto"/>
-      </w:pPr>
-      <w:r>
-        <w:t xml:space="preserve">Starling has </w:t>
-      </w:r>
-      <w:r>
-        <w:rPr>
-          <w:b/>
-          <w:bCs/>
-        </w:rPr>
-        <w:t xml:space="preserve">spaces</w:t>
-      </w:r>
-      <w:r>
-        <w:t xml:space="preserve"> (virtual desktops) and a </w:t>
-      </w:r>
-      <w:r>
-        <w:rPr>
-          <w:b/>
-          <w:bCs/>
-        </w:rPr>
-        <w:t xml:space="preserve">Mission Control</w:t>
-      </w:r>
-      <w:r>
-        <w:t xml:space="preserve"> overview, driven from the keyboard the way macOS does it.</w:t>
+        <w:spacing w:before="400" w:after="120" w:line="281" w:lineRule="auto"/>
+      </w:pPr>
+      <w:bookmarkStart w:id="100003" w:name="conventions"/>
+      <w:bookmarkEnd w:id="100003"/>
+      <w:r>
+        <w:t xml:space="preserve">Conventions</w:t>
       </w:r>
     </w:p>
     <w:tbl>
@@ -1180,7 +427,7 @@
                 <w:b/>
                 <w:bCs/>
               </w:rPr>
-              <w:t xml:space="preserve">Do this</w:t>
+              <w:t xml:space="preserve">You see</w:t>
             </w:r>
           </w:p>
         </w:tc>
@@ -1197,7 +444,7 @@
                 <w:b/>
                 <w:bCs/>
               </w:rPr>
-              <w:t xml:space="preserve">To</w:t>
+              <w:t xml:space="preserve">It means</w:t>
             </w:r>
           </w:p>
         </w:tc>
@@ -1216,17 +463,7 @@
                 <w:b/>
                 <w:bCs/>
               </w:rPr>
-              <w:t xml:space="preserve">Ctrl + →</w:t>
-            </w:r>
-            <w:r>
-              <w:t xml:space="preserve"> / </w:t>
-            </w:r>
-            <w:r>
-              <w:rPr>
-                <w:b/>
-                <w:bCs/>
-              </w:rPr>
-              <w:t xml:space="preserve">Ctrl + ←</w:t>
+              <w:t xml:space="preserve">Ctrl + ↑</w:t>
             </w:r>
           </w:p>
         </w:tc>
@@ -1239,7 +476,7 @@
               <w:spacing w:after="160" w:line="259" w:lineRule="auto"/>
             </w:pPr>
             <w:r>
-              <w:t xml:space="preserve">Slide to the next / previous space</w:t>
+              <w:t xml:space="preserve">Hold the first key and press the second</w:t>
             </w:r>
           </w:p>
         </w:tc>
@@ -1258,17 +495,7 @@
                 <w:b/>
                 <w:bCs/>
               </w:rPr>
-              <w:t xml:space="preserve">Ctrl + Shift + →</w:t>
-            </w:r>
-            <w:r>
-              <w:t xml:space="preserve"> / </w:t>
-            </w:r>
-            <w:r>
-              <w:rPr>
-                <w:b/>
-                <w:bCs/>
-              </w:rPr>
-              <w:t xml:space="preserve">←</w:t>
+              <w:t xml:space="preserve">Settings → Appearance</w:t>
             </w:r>
           </w:p>
         </w:tc>
@@ -1281,7 +508,7 @@
               <w:spacing w:after="160" w:line="259" w:lineRule="auto"/>
             </w:pPr>
             <w:r>
-              <w:t xml:space="preserve">Carry the focused window to the next / previous space</w:t>
+              <w:t xml:space="preserve">Open Settings, then its Appearance section</w:t>
             </w:r>
           </w:p>
         </w:tc>
@@ -1297,10 +524,9 @@
             </w:pPr>
             <w:r>
               <w:rPr>
-                <w:b/>
-                <w:bCs/>
+                <w:rFonts w:ascii="Liberation Mono" w:hAnsi="Liberation Mono" w:cs="Liberation Mono"/>
               </w:rPr>
-              <w:t xml:space="preserve">Ctrl + Tab</w:t>
+              <w:t xml:space="preserve">~/Videos</w:t>
             </w:r>
           </w:p>
         </w:tc>
@@ -1313,7 +539,7 @@
               <w:spacing w:after="160" w:line="259" w:lineRule="auto"/>
             </w:pPr>
             <w:r>
-              <w:t xml:space="preserve">Cycle through your spaces</w:t>
+              <w:t xml:space="preserve">A path, command or file name, exactly as typed</w:t>
             </w:r>
           </w:p>
         </w:tc>
@@ -1328,11 +554,7 @@
               <w:spacing w:after="160" w:line="259" w:lineRule="auto"/>
             </w:pPr>
             <w:r>
-              <w:rPr>
-                <w:b/>
-                <w:bCs/>
-              </w:rPr>
-              <w:t xml:space="preserve">Ctrl + ↑</w:t>
+              <w:t xml:space="preserve">A quoted note like the one below</w:t>
             </w:r>
           </w:p>
         </w:tc>
@@ -1345,91 +567,7 @@
               <w:spacing w:after="160" w:line="259" w:lineRule="auto"/>
             </w:pPr>
             <w:r>
-              <w:t xml:space="preserve">Open </w:t>
-            </w:r>
-            <w:r>
-              <w:rPr>
-                <w:b/>
-                <w:bCs/>
-              </w:rPr>
-              <w:t xml:space="preserve">Mission Control</w:t>
-            </w:r>
-            <w:r>
-              <w:t xml:space="preserve"> (all spaces and windows at once)</w:t>
-            </w:r>
-          </w:p>
-        </w:tc>
-      </w:tr>
-      <w:tr>
-        <w:tc>
-          <w:tcPr>
-            <w:tcW w:w="4680" w:type="dxa"/>
-          </w:tcPr>
-          <w:p>
-            <w:pPr>
-              <w:spacing w:after="160" w:line="259" w:lineRule="auto"/>
-            </w:pPr>
-            <w:r>
-              <w:rPr>
-                <w:b/>
-                <w:bCs/>
-              </w:rPr>
-              <w:t xml:space="preserve">Ctrl + ↓</w:t>
-            </w:r>
-          </w:p>
-        </w:tc>
-        <w:tc>
-          <w:tcPr>
-            <w:tcW w:w="4680" w:type="dxa"/>
-          </w:tcPr>
-          <w:p>
-            <w:pPr>
-              <w:spacing w:after="160" w:line="259" w:lineRule="auto"/>
-            </w:pPr>
-            <w:r>
-              <w:t xml:space="preserve">Open your </w:t>
-            </w:r>
-            <w:r>
-              <w:rPr>
-                <w:b/>
-                <w:bCs/>
-              </w:rPr>
-              <w:t xml:space="preserve">workspace</w:t>
-            </w:r>
-            <w:r>
-              <w:t xml:space="preserve"> (see below)</w:t>
-            </w:r>
-          </w:p>
-        </w:tc>
-      </w:tr>
-      <w:tr>
-        <w:tc>
-          <w:tcPr>
-            <w:tcW w:w="4680" w:type="dxa"/>
-          </w:tcPr>
-          <w:p>
-            <w:pPr>
-              <w:spacing w:after="160" w:line="259" w:lineRule="auto"/>
-            </w:pPr>
-            <w:r>
-              <w:rPr>
-                <w:b/>
-                <w:bCs/>
-              </w:rPr>
-              <w:t xml:space="preserve">Esc</w:t>
-            </w:r>
-          </w:p>
-        </w:tc>
-        <w:tc>
-          <w:tcPr>
-            <w:tcW w:w="4680" w:type="dxa"/>
-          </w:tcPr>
-          <w:p>
-            <w:pPr>
-              <w:spacing w:after="160" w:line="259" w:lineRule="auto"/>
-            </w:pPr>
-            <w:r>
-              <w:t xml:space="preserve">Close Mission Control</w:t>
+              <w:t xml:space="preserve">Something worth knowing before you go on</w:t>
             </w:r>
           </w:p>
         </w:tc>
@@ -1437,44 +575,33 @@
     </w:tbl>
     <w:p>
       <w:pPr>
-        <w:spacing w:after="160" w:line="259" w:lineRule="auto"/>
-      </w:pPr>
-      <w:r>
-        <w:t xml:space="preserve">In Mission Control, </w:t>
-      </w:r>
-      <w:r>
-        <w:rPr>
-          <w:b/>
-          <w:bCs/>
-        </w:rPr>
-        <w:t xml:space="preserve">Ctrl + ← / →</w:t>
-      </w:r>
-      <w:r>
-        <w:t xml:space="preserve"> retargets the active space instantly. To add a space, right-click the wallpaper and choose </w:t>
-      </w:r>
-      <w:r>
-        <w:rPr>
-          <w:b/>
-          <w:bCs/>
-        </w:rPr>
-        <w:t xml:space="preserve">New Desktop</w:t>
-      </w:r>
-      <w:r>
-        <w:t xml:space="preserve">.</w:t>
-      </w:r>
-    </w:p>
-    <w:p>
-      <w:pPr>
-        <w:spacing w:after="160" w:line="259" w:lineRule="auto"/>
-      </w:pPr>
-      <w:r>
-        <w:rPr>
-          <w:rFonts w:ascii="Liberation Mono" w:hAnsi="Liberation Mono" w:cs="Liberation Mono"/>
-        </w:rPr>
-        <w:t xml:space="preserve">Ctrl</w:t>
-      </w:r>
-      <w:r>
-        <w:t xml:space="preserve"> + arrows belong to the system — apps never see them — so they work no matter which window is focused.</w:t>
+        <w:pStyle w:val="Quote"/>
+        <w:pBdr>
+          <w:left w:val="single" w:sz="24" w:space="14" w:color="C8102E"/>
+        </w:pBdr>
+        <w:spacing w:before="160" w:after="200" w:line="281" w:lineRule="auto"/>
+        <w:ind w:left="600" w:right="600"/>
+      </w:pPr>
+      <w:r>
+        <w:rPr>
+          <w:b/>
+          <w:bCs/>
+        </w:rPr>
+        <w:t xml:space="preserve">Note.</w:t>
+      </w:r>
+      <w:r>
+        <w:t xml:space="preserve"> Starling is an early preview. The limits that will matter most are listed in </w:t>
+      </w:r>
+      <w:hyperlink w:anchor="things-to-know-in-this-release">
+        <w:r>
+          <w:rPr>
+            <w:rStyle w:val="Hyperlink"/>
+          </w:rPr>
+          <w:t xml:space="preserve">Things to know in this release</w:t>
+        </w:r>
+      </w:hyperlink>
+      <w:r>
+        <w:t xml:space="preserve">; read that section first if you plan to rely on the desktop every day.</w:t>
       </w:r>
     </w:p>
     <w:p>
@@ -1488,125 +615,86 @@
         </w:pBdr>
         <w:spacing w:before="560" w:after="200" w:line="281" w:lineRule="auto"/>
       </w:pPr>
-      <w:r>
-        <w:t xml:space="preserve">Right-click the desktop</w:t>
-      </w:r>
-    </w:p>
-    <w:p>
-      <w:pPr>
-        <w:pageBreakBefore/>
-        <w:spacing w:after="160" w:line="259" w:lineRule="auto"/>
-      </w:pPr>
-      <w:r>
-        <w:t xml:space="preserve">Right-click anywhere on the wallpaper for the desktop menu:</w:t>
-      </w:r>
-    </w:p>
-    <w:p>
-      <w:pPr>
-        <w:numPr>
-          <w:ilvl w:val="0"/>
-          <w:numId w:val="1"/>
-        </w:numPr>
-        <w:spacing w:after="160" w:line="259" w:lineRule="auto"/>
-      </w:pPr>
-      <w:r>
-        <w:rPr>
-          <w:b/>
-          <w:bCs/>
-        </w:rPr>
-        <w:t xml:space="preserve">Change Wallpaper</w:t>
-      </w:r>
-    </w:p>
-    <w:p>
-      <w:pPr>
-        <w:numPr>
-          <w:ilvl w:val="0"/>
-          <w:numId w:val="1"/>
-        </w:numPr>
-        <w:spacing w:after="160" w:line="259" w:lineRule="auto"/>
-      </w:pPr>
-      <w:r>
-        <w:rPr>
-          <w:b/>
-          <w:bCs/>
-        </w:rPr>
-        <w:t xml:space="preserve">Mission Control</w:t>
-      </w:r>
-    </w:p>
-    <w:p>
-      <w:pPr>
-        <w:numPr>
-          <w:ilvl w:val="0"/>
-          <w:numId w:val="1"/>
-        </w:numPr>
-        <w:spacing w:after="160" w:line="259" w:lineRule="auto"/>
-      </w:pPr>
-      <w:r>
-        <w:rPr>
-          <w:b/>
-          <w:bCs/>
-        </w:rPr>
-        <w:t xml:space="preserve">New Desktop</w:t>
-      </w:r>
-      <w:r>
-        <w:t xml:space="preserve"> — add a space</w:t>
-      </w:r>
-    </w:p>
-    <w:p>
-      <w:pPr>
-        <w:numPr>
-          <w:ilvl w:val="0"/>
-          <w:numId w:val="1"/>
-        </w:numPr>
-        <w:spacing w:after="160" w:line="259" w:lineRule="auto"/>
-      </w:pPr>
-      <w:r>
-        <w:rPr>
-          <w:b/>
-          <w:bCs/>
-        </w:rPr>
-        <w:t xml:space="preserve">Workspace</w:t>
-      </w:r>
-    </w:p>
-    <w:p>
-      <w:pPr>
-        <w:numPr>
-          <w:ilvl w:val="0"/>
-          <w:numId w:val="1"/>
-        </w:numPr>
-        <w:spacing w:after="160" w:line="259" w:lineRule="auto"/>
-      </w:pPr>
-      <w:r>
-        <w:t xml:space="preserve">switch </w:t>
-      </w:r>
-      <w:r>
-        <w:rPr>
-          <w:b/>
-          <w:bCs/>
-        </w:rPr>
-        <w:t xml:space="preserve">appearance</w:t>
-      </w:r>
-      <w:r>
-        <w:t xml:space="preserve"> (light / dark)</w:t>
-      </w:r>
-    </w:p>
-    <w:p>
-      <w:pPr>
-        <w:numPr>
-          <w:ilvl w:val="0"/>
-          <w:numId w:val="1"/>
-        </w:numPr>
-        <w:spacing w:after="160" w:line="259" w:lineRule="auto"/>
-      </w:pPr>
-      <w:r>
-        <w:rPr>
-          <w:b/>
-          <w:bCs/>
-        </w:rPr>
-        <w:t xml:space="preserve">Remove This Desktop</w:t>
-      </w:r>
-      <w:r>
-        <w:t xml:space="preserve"> — when you have more than one</w:t>
+      <w:bookmarkStart w:id="100004" w:name="choosing-starling-at-login"/>
+      <w:bookmarkEnd w:id="100004"/>
+      <w:r>
+        <w:t xml:space="preserve">Choosing Starling at login</w:t>
+      </w:r>
+    </w:p>
+    <w:p>
+      <w:pPr>
+        <w:spacing w:after="160" w:line="259" w:lineRule="auto"/>
+      </w:pPr>
+      <w:r>
+        <w:t xml:space="preserve">Installing Starling doesn't replace your current desktop — it adds a session you pick at the login screen. To start it:</w:t>
+      </w:r>
+    </w:p>
+    <w:p>
+      <w:pPr>
+        <w:numPr>
+          <w:ilvl w:val="0"/>
+          <w:numId w:val="4"/>
+        </w:numPr>
+        <w:spacing w:after="160" w:line="259" w:lineRule="auto"/>
+      </w:pPr>
+      <w:r>
+        <w:rPr>
+          <w:b/>
+          <w:bCs/>
+        </w:rPr>
+        <w:t xml:space="preserve">Click your name</w:t>
+      </w:r>
+      <w:r>
+        <w:t xml:space="preserve"> at the login screen.</w:t>
+      </w:r>
+    </w:p>
+    <w:p>
+      <w:pPr>
+        <w:numPr>
+          <w:ilvl w:val="0"/>
+          <w:numId w:val="4"/>
+        </w:numPr>
+        <w:spacing w:after="160" w:line="259" w:lineRule="auto"/>
+      </w:pPr>
+      <w:r>
+        <w:rPr>
+          <w:b/>
+          <w:bCs/>
+        </w:rPr>
+        <w:t xml:space="preserve">Open the session menu</w:t>
+      </w:r>
+      <w:r>
+        <w:t xml:space="preserve"> — usually a gear, or a small icon in a lower corner of the password box.</w:t>
+      </w:r>
+    </w:p>
+    <w:p>
+      <w:pPr>
+        <w:numPr>
+          <w:ilvl w:val="0"/>
+          <w:numId w:val="4"/>
+        </w:numPr>
+        <w:spacing w:after="160" w:line="259" w:lineRule="auto"/>
+      </w:pPr>
+      <w:r>
+        <w:t xml:space="preserve">Choose </w:t>
+      </w:r>
+      <w:r>
+        <w:rPr>
+          <w:b/>
+          <w:bCs/>
+        </w:rPr>
+        <w:t xml:space="preserve">Starling</w:t>
+      </w:r>
+      <w:r>
+        <w:t xml:space="preserve"> from the list, then enter your password and sign in.</w:t>
+      </w:r>
+    </w:p>
+    <w:p>
+      <w:pPr>
+        <w:spacing w:after="160" w:line="259" w:lineRule="auto"/>
+      </w:pPr>
+      <w:r>
+        <w:t xml:space="preserve">Starling stays selected for next time. The session menu only appears with a Wayland-capable login manager (GDM has one); it looks a little different on LightDM or SDDM, but the step is the same — find the session picker and choose Starling. (See the Installation Guide if you don't see a session menu at all.)</w:t>
       </w:r>
     </w:p>
     <w:p>
@@ -1620,8 +708,1252 @@
         </w:pBdr>
         <w:spacing w:before="560" w:after="200" w:line="281" w:lineRule="auto"/>
       </w:pPr>
-      <w:r>
-        <w:t xml:space="preserve">Keyboard shortcuts</w:t>
+      <w:bookmarkStart w:id="100005" w:name="first-login"/>
+      <w:bookmarkEnd w:id="100005"/>
+      <w:r>
+        <w:t xml:space="preserve">First login</w:t>
+      </w:r>
+    </w:p>
+    <w:p>
+      <w:pPr>
+        <w:spacing w:after="160" w:line="259" w:lineRule="auto"/>
+      </w:pPr>
+      <w:r>
+        <w:t xml:space="preserve">Once you sign in, you land on the desktop:</w:t>
+      </w:r>
+    </w:p>
+    <w:p>
+      <w:pPr>
+        <w:numPr>
+          <w:ilvl w:val="0"/>
+          <w:numId w:val="1"/>
+        </w:numPr>
+        <w:spacing w:after="160" w:line="259" w:lineRule="auto"/>
+      </w:pPr>
+      <w:r>
+        <w:t xml:space="preserve">a </w:t>
+      </w:r>
+      <w:r>
+        <w:rPr>
+          <w:b/>
+          <w:bCs/>
+        </w:rPr>
+        <w:t xml:space="preserve">wallpaper</w:t>
+      </w:r>
+      <w:r>
+        <w:t xml:space="preserve"> filling the screen,</w:t>
+      </w:r>
+    </w:p>
+    <w:p>
+      <w:pPr>
+        <w:numPr>
+          <w:ilvl w:val="0"/>
+          <w:numId w:val="1"/>
+        </w:numPr>
+        <w:spacing w:after="160" w:line="259" w:lineRule="auto"/>
+      </w:pPr>
+      <w:r>
+        <w:t xml:space="preserve">a thin </w:t>
+      </w:r>
+      <w:hyperlink w:anchor="the-menu-bar">
+        <w:r>
+          <w:rPr>
+            <w:rStyle w:val="Hyperlink"/>
+          </w:rPr>
+          <w:t xml:space="preserve">**menu bar**</w:t>
+        </w:r>
+      </w:hyperlink>
+      <w:r>
+        <w:t xml:space="preserve"> across the top, with the clock and status indicators,</w:t>
+      </w:r>
+    </w:p>
+    <w:p>
+      <w:pPr>
+        <w:numPr>
+          <w:ilvl w:val="0"/>
+          <w:numId w:val="1"/>
+        </w:numPr>
+        <w:spacing w:after="160" w:line="259" w:lineRule="auto"/>
+      </w:pPr>
+      <w:r>
+        <w:t xml:space="preserve">a </w:t>
+      </w:r>
+      <w:hyperlink w:anchor="the-dock">
+        <w:r>
+          <w:rPr>
+            <w:rStyle w:val="Hyperlink"/>
+          </w:rPr>
+          <w:t xml:space="preserve">**dock**</w:t>
+        </w:r>
+      </w:hyperlink>
+      <w:r>
+        <w:t xml:space="preserve"> floating at the bottom, holding your apps.</w:t>
+      </w:r>
+    </w:p>
+    <w:p>
+      <w:pPr>
+        <w:spacing w:after="160" w:line="259" w:lineRule="auto"/>
+      </w:pPr>
+      <w:r>
+        <w:t xml:space="preserve">That is the whole desktop. Everything else is reached from the dock, the </w:t>
+      </w:r>
+      <w:hyperlink w:anchor="the-launchpad">
+        <w:r>
+          <w:rPr>
+            <w:rStyle w:val="Hyperlink"/>
+          </w:rPr>
+          <w:t xml:space="preserve">Launchpad</w:t>
+        </w:r>
+      </w:hyperlink>
+      <w:r>
+        <w:t xml:space="preserve">, or a </w:t>
+      </w:r>
+      <w:hyperlink w:anchor="right-click-the-desktop">
+        <w:r>
+          <w:rPr>
+            <w:rStyle w:val="Hyperlink"/>
+          </w:rPr>
+          <w:t xml:space="preserve">right-click on the wallpaper</w:t>
+        </w:r>
+      </w:hyperlink>
+      <w:r>
+        <w:t xml:space="preserve">.</w:t>
+      </w:r>
+    </w:p>
+    <w:p>
+      <w:pPr>
+        <w:pStyle w:val="Quote"/>
+        <w:pBdr>
+          <w:left w:val="single" w:sz="24" w:space="14" w:color="C8102E"/>
+        </w:pBdr>
+        <w:spacing w:before="160" w:after="200" w:line="281" w:lineRule="auto"/>
+        <w:ind w:left="600" w:right="600"/>
+      </w:pPr>
+      <w:r>
+        <w:rPr>
+          <w:b/>
+          <w:bCs/>
+        </w:rPr>
+        <w:t xml:space="preserve">Tip.</w:t>
+      </w:r>
+      <w:r>
+        <w:t xml:space="preserve"> The keyboard reaches most of it too. The whole list is in </w:t>
+      </w:r>
+      <w:hyperlink w:anchor="keyboard-shortcuts">
+        <w:r>
+          <w:rPr>
+            <w:rStyle w:val="Hyperlink"/>
+          </w:rPr>
+          <w:t xml:space="preserve">Keyboard shortcuts</w:t>
+        </w:r>
+      </w:hyperlink>
+      <w:r>
+        <w:t xml:space="preserve">; the four to learn first are </w:t>
+      </w:r>
+      <w:r>
+        <w:rPr>
+          <w:b/>
+          <w:bCs/>
+        </w:rPr>
+        <w:t xml:space="preserve">Ctrl + ↑</w:t>
+      </w:r>
+      <w:r>
+        <w:t xml:space="preserve"> for Mission Control, </w:t>
+      </w:r>
+      <w:r>
+        <w:rPr>
+          <w:b/>
+          <w:bCs/>
+        </w:rPr>
+        <w:t xml:space="preserve">Ctrl + ←</w:t>
+      </w:r>
+      <w:r>
+        <w:t xml:space="preserve"> / </w:t>
+      </w:r>
+      <w:r>
+        <w:rPr>
+          <w:b/>
+          <w:bCs/>
+        </w:rPr>
+        <w:t xml:space="preserve">→</w:t>
+      </w:r>
+      <w:r>
+        <w:t xml:space="preserve"> to move between spaces, </w:t>
+      </w:r>
+      <w:r>
+        <w:rPr>
+          <w:b/>
+          <w:bCs/>
+        </w:rPr>
+        <w:t xml:space="preserve">Ctrl + ↓</w:t>
+      </w:r>
+      <w:r>
+        <w:t xml:space="preserve"> for your workspace and </w:t>
+      </w:r>
+      <w:r>
+        <w:rPr>
+          <w:b/>
+          <w:bCs/>
+        </w:rPr>
+        <w:t xml:space="preserve">Esc</w:t>
+      </w:r>
+      <w:r>
+        <w:t xml:space="preserve"> to back out of any of them.</w:t>
+      </w:r>
+    </w:p>
+    <w:p>
+      <w:pPr>
+        <w:pStyle w:val="Heading1"/>
+        <w:keepNext/>
+        <w:keepLines/>
+        <w:pageBreakBefore/>
+        <w:pBdr>
+          <w:bottom w:val="single" w:sz="12" w:space="6" w:color="C8102E"/>
+        </w:pBdr>
+        <w:spacing w:before="560" w:after="200" w:line="281" w:lineRule="auto"/>
+      </w:pPr>
+      <w:bookmarkStart w:id="100006" w:name="the-dock"/>
+      <w:bookmarkEnd w:id="100006"/>
+      <w:r>
+        <w:t xml:space="preserve">The dock</w:t>
+      </w:r>
+    </w:p>
+    <w:p>
+      <w:pPr>
+        <w:pageBreakBefore/>
+        <w:spacing w:after="160" w:line="259" w:lineRule="auto"/>
+      </w:pPr>
+      <w:r>
+        <w:t xml:space="preserve">The dock sits at the bottom of the screen. Out of the box it holds the first-party apps, in order: </w:t>
+      </w:r>
+      <w:r>
+        <w:rPr>
+          <w:b/>
+          <w:bCs/>
+        </w:rPr>
+        <w:t xml:space="preserve">Launchpad</w:t>
+      </w:r>
+      <w:r>
+        <w:t xml:space="preserve">, </w:t>
+      </w:r>
+      <w:r>
+        <w:rPr>
+          <w:b/>
+          <w:bCs/>
+        </w:rPr>
+        <w:t xml:space="preserve">Settings</w:t>
+      </w:r>
+      <w:r>
+        <w:t xml:space="preserve">, </w:t>
+      </w:r>
+      <w:r>
+        <w:rPr>
+          <w:b/>
+          <w:bCs/>
+        </w:rPr>
+        <w:t xml:space="preserve">Files</w:t>
+      </w:r>
+      <w:r>
+        <w:t xml:space="preserve">, </w:t>
+      </w:r>
+      <w:r>
+        <w:rPr>
+          <w:b/>
+          <w:bCs/>
+        </w:rPr>
+        <w:t xml:space="preserve">Terminal</w:t>
+      </w:r>
+      <w:r>
+        <w:t xml:space="preserve">, </w:t>
+      </w:r>
+      <w:r>
+        <w:rPr>
+          <w:b/>
+          <w:bCs/>
+        </w:rPr>
+        <w:t xml:space="preserve">Text Editor</w:t>
+      </w:r>
+      <w:r>
+        <w:t xml:space="preserve">, </w:t>
+      </w:r>
+      <w:r>
+        <w:rPr>
+          <w:b/>
+          <w:bCs/>
+        </w:rPr>
+        <w:t xml:space="preserve">Calculator</w:t>
+      </w:r>
+      <w:r>
+        <w:t xml:space="preserve">, </w:t>
+      </w:r>
+      <w:r>
+        <w:rPr>
+          <w:b/>
+          <w:bCs/>
+        </w:rPr>
+        <w:t xml:space="preserve">App Store</w:t>
+      </w:r>
+      <w:r>
+        <w:t xml:space="preserve">, </w:t>
+      </w:r>
+      <w:r>
+        <w:rPr>
+          <w:b/>
+          <w:bCs/>
+        </w:rPr>
+        <w:t xml:space="preserve">Video Player</w:t>
+      </w:r>
+      <w:r>
+        <w:t xml:space="preserve">.</w:t>
+      </w:r>
+    </w:p>
+    <w:p>
+      <w:pPr>
+        <w:numPr>
+          <w:ilvl w:val="0"/>
+          <w:numId w:val="1"/>
+        </w:numPr>
+        <w:spacing w:after="160" w:line="259" w:lineRule="auto"/>
+      </w:pPr>
+      <w:r>
+        <w:rPr>
+          <w:b/>
+          <w:bCs/>
+        </w:rPr>
+        <w:t xml:space="preserve">Click</w:t>
+      </w:r>
+      <w:r>
+        <w:t xml:space="preserve"> an icon to launch or focus that app.</w:t>
+      </w:r>
+    </w:p>
+    <w:p>
+      <w:pPr>
+        <w:numPr>
+          <w:ilvl w:val="0"/>
+          <w:numId w:val="1"/>
+        </w:numPr>
+        <w:spacing w:after="160" w:line="259" w:lineRule="auto"/>
+      </w:pPr>
+      <w:r>
+        <w:t xml:space="preserve">A </w:t>
+      </w:r>
+      <w:r>
+        <w:rPr>
+          <w:b/>
+          <w:bCs/>
+        </w:rPr>
+        <w:t xml:space="preserve">running app shows an indicator</w:t>
+      </w:r>
+      <w:r>
+        <w:t xml:space="preserve"> under its icon.</w:t>
+      </w:r>
+    </w:p>
+    <w:p>
+      <w:pPr>
+        <w:numPr>
+          <w:ilvl w:val="0"/>
+          <w:numId w:val="1"/>
+        </w:numPr>
+        <w:spacing w:after="160" w:line="259" w:lineRule="auto"/>
+      </w:pPr>
+      <w:r>
+        <w:rPr>
+          <w:b/>
+          <w:bCs/>
+        </w:rPr>
+        <w:t xml:space="preserve">Drag</w:t>
+      </w:r>
+      <w:r>
+        <w:t xml:space="preserve"> an icon to reorder the dock.</w:t>
+      </w:r>
+    </w:p>
+    <w:p>
+      <w:pPr>
+        <w:numPr>
+          <w:ilvl w:val="0"/>
+          <w:numId w:val="1"/>
+        </w:numPr>
+        <w:spacing w:after="160" w:line="259" w:lineRule="auto"/>
+      </w:pPr>
+      <w:r>
+        <w:rPr>
+          <w:b/>
+          <w:bCs/>
+        </w:rPr>
+        <w:t xml:space="preserve">Right-click</w:t>
+      </w:r>
+      <w:r>
+        <w:t xml:space="preserve"> an icon for its menu, including </w:t>
+      </w:r>
+      <w:r>
+        <w:rPr>
+          <w:b/>
+          <w:bCs/>
+        </w:rPr>
+        <w:t xml:space="preserve">Remove from Dock</w:t>
+      </w:r>
+      <w:r>
+        <w:t xml:space="preserve">.</w:t>
+      </w:r>
+    </w:p>
+    <w:p>
+      <w:pPr>
+        <w:spacing w:after="160" w:line="259" w:lineRule="auto"/>
+      </w:pPr>
+      <w:r>
+        <w:t xml:space="preserve">Installed apps that aren't pinned appear in the dock while they run, and drop off when they close.</w:t>
+      </w:r>
+    </w:p>
+    <w:p>
+      <w:pPr>
+        <w:pStyle w:val="Quote"/>
+        <w:pBdr>
+          <w:left w:val="single" w:sz="24" w:space="14" w:color="C8102E"/>
+        </w:pBdr>
+        <w:spacing w:before="160" w:after="200" w:line="281" w:lineRule="auto"/>
+        <w:ind w:left="600" w:right="600"/>
+      </w:pPr>
+      <w:r>
+        <w:rPr>
+          <w:b/>
+          <w:bCs/>
+        </w:rPr>
+        <w:t xml:space="preserve">Tip.</w:t>
+      </w:r>
+      <w:r>
+        <w:t xml:space="preserve"> Apps you add later — from the App Store or with your distribution's packaging — show up in the Launchpad first; see </w:t>
+      </w:r>
+      <w:hyperlink w:anchor="installing-more-apps">
+        <w:r>
+          <w:rPr>
+            <w:rStyle w:val="Hyperlink"/>
+          </w:rPr>
+          <w:t xml:space="preserve">Installing more apps</w:t>
+        </w:r>
+      </w:hyperlink>
+      <w:r>
+        <w:t xml:space="preserve">.</w:t>
+      </w:r>
+    </w:p>
+    <w:p>
+      <w:pPr>
+        <w:pStyle w:val="Heading1"/>
+        <w:keepNext/>
+        <w:keepLines/>
+        <w:pageBreakBefore/>
+        <w:pBdr>
+          <w:bottom w:val="single" w:sz="12" w:space="6" w:color="C8102E"/>
+        </w:pBdr>
+        <w:spacing w:before="560" w:after="200" w:line="281" w:lineRule="auto"/>
+      </w:pPr>
+      <w:bookmarkStart w:id="100007" w:name="the-launchpad"/>
+      <w:bookmarkEnd w:id="100007"/>
+      <w:r>
+        <w:t xml:space="preserve">The Launchpad</w:t>
+      </w:r>
+    </w:p>
+    <w:p>
+      <w:pPr>
+        <w:pageBreakBefore/>
+        <w:spacing w:after="160" w:line="259" w:lineRule="auto"/>
+      </w:pPr>
+      <w:r>
+        <w:t xml:space="preserve">The first dock icon opens the </w:t>
+      </w:r>
+      <w:r>
+        <w:rPr>
+          <w:b/>
+          <w:bCs/>
+        </w:rPr>
+        <w:t xml:space="preserve">Launchpad</w:t>
+      </w:r>
+      <w:r>
+        <w:t xml:space="preserve"> — a full-screen grid of every app Starling knows about, over a blurred background.</w:t>
+      </w:r>
+    </w:p>
+    <w:p>
+      <w:pPr>
+        <w:numPr>
+          <w:ilvl w:val="0"/>
+          <w:numId w:val="1"/>
+        </w:numPr>
+        <w:spacing w:after="160" w:line="259" w:lineRule="auto"/>
+      </w:pPr>
+      <w:r>
+        <w:rPr>
+          <w:b/>
+          <w:bCs/>
+        </w:rPr>
+        <w:t xml:space="preserve">Click</w:t>
+      </w:r>
+      <w:r>
+        <w:t xml:space="preserve"> any app to launch it.</w:t>
+      </w:r>
+    </w:p>
+    <w:p>
+      <w:pPr>
+        <w:numPr>
+          <w:ilvl w:val="0"/>
+          <w:numId w:val="1"/>
+        </w:numPr>
+        <w:spacing w:after="160" w:line="259" w:lineRule="auto"/>
+      </w:pPr>
+      <w:r>
+        <w:rPr>
+          <w:b/>
+          <w:bCs/>
+        </w:rPr>
+        <w:t xml:space="preserve">Type</w:t>
+      </w:r>
+      <w:r>
+        <w:t xml:space="preserve"> to filter the grid by name — start typing and only matching apps remain.</w:t>
+      </w:r>
+    </w:p>
+    <w:p>
+      <w:pPr>
+        <w:numPr>
+          <w:ilvl w:val="0"/>
+          <w:numId w:val="1"/>
+        </w:numPr>
+        <w:spacing w:after="160" w:line="259" w:lineRule="auto"/>
+      </w:pPr>
+      <w:r>
+        <w:t xml:space="preserve">Click empty space or press </w:t>
+      </w:r>
+      <w:r>
+        <w:rPr>
+          <w:b/>
+          <w:bCs/>
+        </w:rPr>
+        <w:t xml:space="preserve">Esc</w:t>
+      </w:r>
+      <w:r>
+        <w:t xml:space="preserve"> to dismiss it.</w:t>
+      </w:r>
+    </w:p>
+    <w:p>
+      <w:pPr>
+        <w:pStyle w:val="Heading1"/>
+        <w:keepNext/>
+        <w:keepLines/>
+        <w:pageBreakBefore/>
+        <w:pBdr>
+          <w:bottom w:val="single" w:sz="12" w:space="6" w:color="C8102E"/>
+        </w:pBdr>
+        <w:spacing w:before="560" w:after="200" w:line="281" w:lineRule="auto"/>
+      </w:pPr>
+      <w:bookmarkStart w:id="100008" w:name="the-menu-bar"/>
+      <w:bookmarkEnd w:id="100008"/>
+      <w:r>
+        <w:t xml:space="preserve">The menu bar</w:t>
+      </w:r>
+    </w:p>
+    <w:p>
+      <w:pPr>
+        <w:pageBreakBefore/>
+        <w:spacing w:after="160" w:line="259" w:lineRule="auto"/>
+      </w:pPr>
+      <w:r>
+        <w:t xml:space="preserve">The bar along the top carries the clock and date on the left, and on the right the Wi-Fi and battery indicators, a </w:t>
+      </w:r>
+      <w:r>
+        <w:rPr>
+          <w:b/>
+          <w:bCs/>
+        </w:rPr>
+        <w:t xml:space="preserve">bell</w:t>
+      </w:r>
+      <w:r>
+        <w:t xml:space="preserve">, and the </w:t>
+      </w:r>
+      <w:r>
+        <w:rPr>
+          <w:b/>
+          <w:bCs/>
+        </w:rPr>
+        <w:t xml:space="preserve">control centre</w:t>
+      </w:r>
+      <w:r>
+        <w:t xml:space="preserve">.</w:t>
+      </w:r>
+    </w:p>
+    <w:p>
+      <w:pPr>
+        <w:spacing w:after="160" w:line="259" w:lineRule="auto"/>
+      </w:pPr>
+      <w:r>
+        <w:t xml:space="preserve">Click the control-centre icon for a panel of quick toggles:</w:t>
+      </w:r>
+    </w:p>
+    <w:p>
+      <w:pPr>
+        <w:numPr>
+          <w:ilvl w:val="0"/>
+          <w:numId w:val="1"/>
+        </w:numPr>
+        <w:spacing w:after="160" w:line="259" w:lineRule="auto"/>
+      </w:pPr>
+      <w:r>
+        <w:rPr>
+          <w:b/>
+          <w:bCs/>
+        </w:rPr>
+        <w:t xml:space="preserve">Wi-Fi</w:t>
+      </w:r>
+      <w:r>
+        <w:t xml:space="preserve"> — join a network without opening Settings.</w:t>
+      </w:r>
+    </w:p>
+    <w:p>
+      <w:pPr>
+        <w:numPr>
+          <w:ilvl w:val="0"/>
+          <w:numId w:val="1"/>
+        </w:numPr>
+        <w:spacing w:after="160" w:line="259" w:lineRule="auto"/>
+      </w:pPr>
+      <w:r>
+        <w:rPr>
+          <w:b/>
+          <w:bCs/>
+        </w:rPr>
+        <w:t xml:space="preserve">Dark Mode</w:t>
+      </w:r>
+      <w:r>
+        <w:t xml:space="preserve"> — switches the whole desktop and every first-party app.</w:t>
+      </w:r>
+    </w:p>
+    <w:p>
+      <w:pPr>
+        <w:numPr>
+          <w:ilvl w:val="0"/>
+          <w:numId w:val="1"/>
+        </w:numPr>
+        <w:spacing w:after="160" w:line="259" w:lineRule="auto"/>
+      </w:pPr>
+      <w:r>
+        <w:rPr>
+          <w:b/>
+          <w:bCs/>
+        </w:rPr>
+        <w:t xml:space="preserve">Tiling</w:t>
+      </w:r>
+      <w:r>
+        <w:t xml:space="preserve"> — retiles the current space; toggle it off to restore floating windows.</w:t>
+      </w:r>
+    </w:p>
+    <w:p>
+      <w:pPr>
+        <w:numPr>
+          <w:ilvl w:val="0"/>
+          <w:numId w:val="1"/>
+        </w:numPr>
+        <w:spacing w:after="160" w:line="259" w:lineRule="auto"/>
+      </w:pPr>
+      <w:r>
+        <w:rPr>
+          <w:b/>
+          <w:bCs/>
+        </w:rPr>
+        <w:t xml:space="preserve">Muted</w:t>
+      </w:r>
+      <w:r>
+        <w:t xml:space="preserve"> — mute or unmute output, with </w:t>
+      </w:r>
+      <w:r>
+        <w:rPr>
+          <w:b/>
+          <w:bCs/>
+        </w:rPr>
+        <w:t xml:space="preserve">volume</w:t>
+      </w:r>
+      <w:r>
+        <w:t xml:space="preserve"> and </w:t>
+      </w:r>
+      <w:r>
+        <w:rPr>
+          <w:b/>
+          <w:bCs/>
+        </w:rPr>
+        <w:t xml:space="preserve">brightness</w:t>
+      </w:r>
+      <w:r>
+        <w:t xml:space="preserve"> sliders below the tiles.</w:t>
+      </w:r>
+    </w:p>
+    <w:p>
+      <w:pPr>
+        <w:numPr>
+          <w:ilvl w:val="0"/>
+          <w:numId w:val="1"/>
+        </w:numPr>
+        <w:spacing w:after="160" w:line="259" w:lineRule="auto"/>
+      </w:pPr>
+      <w:r>
+        <w:rPr>
+          <w:b/>
+          <w:bCs/>
+        </w:rPr>
+        <w:t xml:space="preserve">Record</w:t>
+      </w:r>
+      <w:r>
+        <w:t xml:space="preserve"> and </w:t>
+      </w:r>
+      <w:r>
+        <w:rPr>
+          <w:b/>
+          <w:bCs/>
+        </w:rPr>
+        <w:t xml:space="preserve">Record App</w:t>
+      </w:r>
+      <w:r>
+        <w:t xml:space="preserve"> — see </w:t>
+      </w:r>
+      <w:hyperlink w:anchor="recording-the-screen">
+        <w:r>
+          <w:rPr>
+            <w:rStyle w:val="Hyperlink"/>
+          </w:rPr>
+          <w:t xml:space="preserve">Recording the screen</w:t>
+        </w:r>
+      </w:hyperlink>
+      <w:r>
+        <w:t xml:space="preserve">.</w:t>
+      </w:r>
+    </w:p>
+    <w:p>
+      <w:pPr>
+        <w:spacing w:after="160" w:line="259" w:lineRule="auto"/>
+      </w:pPr>
+      <w:r>
+        <w:t xml:space="preserve">The </w:t>
+      </w:r>
+      <w:r>
+        <w:rPr>
+          <w:b/>
+          <w:bCs/>
+        </w:rPr>
+        <w:t xml:space="preserve">bell</w:t>
+      </w:r>
+      <w:r>
+        <w:t xml:space="preserve"> collects notifications instead of interrupting you with banners: nothing steals focus, and you read what happened when you choose to. Click it for the list, </w:t>
+      </w:r>
+      <w:r>
+        <w:rPr>
+          <w:b/>
+          <w:bCs/>
+        </w:rPr>
+        <w:t xml:space="preserve">Esc</w:t>
+      </w:r>
+      <w:r>
+        <w:t xml:space="preserve"> to dismiss.</w:t>
+      </w:r>
+    </w:p>
+    <w:p>
+      <w:pPr>
+        <w:pStyle w:val="Heading1"/>
+        <w:keepNext/>
+        <w:keepLines/>
+        <w:pageBreakBefore/>
+        <w:pBdr>
+          <w:bottom w:val="single" w:sz="12" w:space="6" w:color="C8102E"/>
+        </w:pBdr>
+        <w:spacing w:before="560" w:after="200" w:line="281" w:lineRule="auto"/>
+      </w:pPr>
+      <w:bookmarkStart w:id="100009" w:name="recording-the-screen"/>
+      <w:bookmarkEnd w:id="100009"/>
+      <w:r>
+        <w:t xml:space="preserve">Recording the screen</w:t>
+      </w:r>
+    </w:p>
+    <w:p>
+      <w:pPr>
+        <w:pageBreakBefore/>
+        <w:spacing w:after="160" w:line="259" w:lineRule="auto"/>
+      </w:pPr>
+      <w:r>
+        <w:t xml:space="preserve">Starling records itself, with no extra software.</w:t>
+      </w:r>
+    </w:p>
+    <w:p>
+      <w:pPr>
+        <w:numPr>
+          <w:ilvl w:val="0"/>
+          <w:numId w:val="1"/>
+        </w:numPr>
+        <w:spacing w:after="160" w:line="259" w:lineRule="auto"/>
+      </w:pPr>
+      <w:r>
+        <w:rPr>
+          <w:b/>
+          <w:bCs/>
+        </w:rPr>
+        <w:t xml:space="preserve">Record</w:t>
+      </w:r>
+      <w:r>
+        <w:t xml:space="preserve"> (control centre, or </w:t>
+      </w:r>
+      <w:r>
+        <w:rPr>
+          <w:b/>
+          <w:bCs/>
+        </w:rPr>
+        <w:t xml:space="preserve">Ctrl + Shift + R</w:t>
+      </w:r>
+      <w:r>
+        <w:t xml:space="preserve">) captures the whole screen.</w:t>
+      </w:r>
+    </w:p>
+    <w:p>
+      <w:pPr>
+        <w:numPr>
+          <w:ilvl w:val="0"/>
+          <w:numId w:val="1"/>
+        </w:numPr>
+        <w:spacing w:after="160" w:line="259" w:lineRule="auto"/>
+      </w:pPr>
+      <w:r>
+        <w:rPr>
+          <w:b/>
+          <w:bCs/>
+        </w:rPr>
+        <w:t xml:space="preserve">Record App</w:t>
+      </w:r>
+      <w:r>
+        <w:t xml:space="preserve"> opens Mission Control and asks which window you want. It captures that window's own content, not the region of screen it sits in, so windows stacked on top never appear and moving or resizing the window mid-recording doesn't spoil the take. The pointer is drawn in and follows the window.</w:t>
+      </w:r>
+    </w:p>
+    <w:p>
+      <w:pPr>
+        <w:spacing w:after="160" w:line="259" w:lineRule="auto"/>
+      </w:pPr>
+      <w:r>
+        <w:t xml:space="preserve">While a recording runs, a </w:t>
+      </w:r>
+      <w:r>
+        <w:rPr>
+          <w:b/>
+          <w:bCs/>
+        </w:rPr>
+        <w:t xml:space="preserve">red dot and a running clock</w:t>
+      </w:r>
+      <w:r>
+        <w:t xml:space="preserve"> sit in the menu bar, so a recording can never be going unnoticed. Stop it the same way you started it.</w:t>
+      </w:r>
+    </w:p>
+    <w:p>
+      <w:pPr>
+        <w:spacing w:after="160" w:line="259" w:lineRule="auto"/>
+      </w:pPr>
+      <w:r>
+        <w:t xml:space="preserve">Recordings land in </w:t>
+      </w:r>
+      <w:r>
+        <w:rPr>
+          <w:rFonts w:ascii="Liberation Mono" w:hAnsi="Liberation Mono" w:cs="Liberation Mono"/>
+          <w:b/>
+          <w:bCs/>
+        </w:rPr>
+        <w:t xml:space="preserve">~/Videos</w:t>
+      </w:r>
+      <w:r>
+        <w:t xml:space="preserve"> as MP4, and the </w:t>
+      </w:r>
+      <w:hyperlink w:anchor="the-apps">
+        <w:r>
+          <w:rPr>
+            <w:rStyle w:val="Hyperlink"/>
+          </w:rPr>
+          <w:t xml:space="preserve">Video Player</w:t>
+        </w:r>
+      </w:hyperlink>
+      <w:r>
+        <w:t xml:space="preserve"> opens them; so does anything else that plays MP4. Where the machine has a hardware H.264 encoder, the frame the compositor already drew goes straight to it as a dma-buf and the CPU never touches a pixel — on a modern laptop that costs about 0.05 of a core. Machines without one fall back to a software encoder, which works but costs more.</w:t>
+      </w:r>
+    </w:p>
+    <w:p>
+      <w:pPr>
+        <w:pStyle w:val="Heading1"/>
+        <w:keepNext/>
+        <w:keepLines/>
+        <w:pageBreakBefore/>
+        <w:pBdr>
+          <w:bottom w:val="single" w:sz="12" w:space="6" w:color="C8102E"/>
+        </w:pBdr>
+        <w:spacing w:before="560" w:after="200" w:line="281" w:lineRule="auto"/>
+      </w:pPr>
+      <w:bookmarkStart w:id="100010" w:name="the-screensaver"/>
+      <w:bookmarkEnd w:id="100010"/>
+      <w:r>
+        <w:t xml:space="preserve">The screensaver</w:t>
+      </w:r>
+    </w:p>
+    <w:p>
+      <w:pPr>
+        <w:pageBreakBefore/>
+        <w:spacing w:after="160" w:line="259" w:lineRule="auto"/>
+      </w:pPr>
+      <w:r>
+        <w:t xml:space="preserve">Leave the desk for ten minutes and the desktop dissolves into a screensaver: your own screen, blurred and drifting behind a slow liquid warp, with the time and date floating over it. Any key, click, or mouse movement brings it straight back — nothing is asked for, so it is decoration, not a lock. </w:t>
+      </w:r>
+      <w:r>
+        <w:rPr>
+          <w:b/>
+          <w:bCs/>
+        </w:rPr>
+        <w:t xml:space="preserve">Ctrl + Shift + S</w:t>
+      </w:r>
+      <w:r>
+        <w:t xml:space="preserve"> shows it immediately.</w:t>
+      </w:r>
+    </w:p>
+    <w:p>
+      <w:pPr>
+        <w:spacing w:after="160" w:line="259" w:lineRule="auto"/>
+      </w:pPr>
+      <w:r>
+        <w:t xml:space="preserve">Change the idle time (or turn it off) in </w:t>
+      </w:r>
+      <w:r>
+        <w:rPr>
+          <w:b/>
+          <w:bCs/>
+        </w:rPr>
+        <w:t xml:space="preserve">Settings → Appearance → Screensaver</w:t>
+      </w:r>
+      <w:r>
+        <w:t xml:space="preserve"> (see </w:t>
+      </w:r>
+      <w:hyperlink w:anchor="settings">
+        <w:r>
+          <w:rPr>
+            <w:rStyle w:val="Hyperlink"/>
+          </w:rPr>
+          <w:t xml:space="preserve">Settings</w:t>
+        </w:r>
+      </w:hyperlink>
+      <w:r>
+        <w:t xml:space="preserve">). Video playback holds it off: an app that tells the desktop it is playing something — Chrome, Firefox, a video player — keeps the screensaver away for as long as it says so, so a film watched without touching the mouse is never interrupted.</w:t>
+      </w:r>
+    </w:p>
+    <w:p>
+      <w:pPr>
+        <w:spacing w:after="160" w:line="259" w:lineRule="auto"/>
+      </w:pPr>
+      <w:r>
+        <w:t xml:space="preserve">For </w:t>
+      </w:r>
+      <w:r>
+        <w:rPr>
+          <w:b/>
+          <w:bCs/>
+        </w:rPr>
+        <w:t xml:space="preserve">aerial footage</w:t>
+      </w:r>
+      <w:r>
+        <w:t xml:space="preserve"> in place of the warp, drop a video file in </w:t>
+      </w:r>
+      <w:r>
+        <w:rPr>
+          <w:rFonts w:ascii="Liberation Mono" w:hAnsi="Liberation Mono" w:cs="Liberation Mono"/>
+        </w:rPr>
+        <w:t xml:space="preserve">~/.local/share/starling/aerials/</w:t>
+      </w:r>
+      <w:r>
+        <w:t xml:space="preserve">:</w:t>
+      </w:r>
+    </w:p>
+    <w:p>
+      <w:pPr>
+        <w:pStyle w:val="Code"/>
+        <w:shd w:val="clear" w:color="auto" w:fill="F3F4F6"/>
+        <w:spacing w:before="120" w:after="120" w:line="252" w:lineRule="auto"/>
+        <w:ind w:left="200" w:right="200"/>
+        <w:contextualSpacing/>
+      </w:pPr>
+      <w:r>
+        <w:t xml:space="preserve">mkdir -p ~/.local/share/starling/aerials</w:t>
+      </w:r>
+    </w:p>
+    <w:p>
+      <w:pPr>
+        <w:pStyle w:val="Code"/>
+        <w:shd w:val="clear" w:color="auto" w:fill="F3F4F6"/>
+        <w:spacing w:before="120" w:after="120" w:line="252" w:lineRule="auto"/>
+        <w:ind w:left="200" w:right="200"/>
+        <w:contextualSpacing/>
+      </w:pPr>
+      <w:r>
+        <w:t xml:space="preserve">cp ~/Downloads/coastline.mp4 ~/.local/share/starling/aerials/</w:t>
+      </w:r>
+    </w:p>
+    <w:p>
+      <w:pPr>
+        <w:spacing w:after="160" w:line="259" w:lineRule="auto"/>
+      </w:pPr>
+      <w:r>
+        <w:t xml:space="preserve">The screensaver dissolves into it and loops it. Starling ships none of its own — the warp needs no assets, and the clips worth watching are large. Any shape works: letterbox bars are cropped away and the picture fills the screen.</w:t>
+      </w:r>
+    </w:p>
+    <w:p>
+      <w:pPr>
+        <w:pStyle w:val="Quote"/>
+        <w:pBdr>
+          <w:left w:val="single" w:sz="24" w:space="14" w:color="C8102E"/>
+        </w:pBdr>
+        <w:spacing w:before="160" w:after="200" w:line="281" w:lineRule="auto"/>
+        <w:ind w:left="600" w:right="600"/>
+      </w:pPr>
+      <w:r>
+        <w:rPr>
+          <w:b/>
+          <w:bCs/>
+        </w:rPr>
+        <w:t xml:space="preserve">Note.</w:t>
+      </w:r>
+      <w:r>
+        <w:t xml:space="preserve"> The screensaver is not a lock: nothing is asked when it clears. See </w:t>
+      </w:r>
+      <w:hyperlink w:anchor="things-to-know-in-this-release">
+        <w:r>
+          <w:rPr>
+            <w:rStyle w:val="Hyperlink"/>
+          </w:rPr>
+          <w:t xml:space="preserve">Things to know in this release</w:t>
+        </w:r>
+      </w:hyperlink>
+      <w:r>
+        <w:t xml:space="preserve">.</w:t>
+      </w:r>
+    </w:p>
+    <w:p>
+      <w:pPr>
+        <w:pStyle w:val="Heading1"/>
+        <w:keepNext/>
+        <w:keepLines/>
+        <w:pageBreakBefore/>
+        <w:pBdr>
+          <w:bottom w:val="single" w:sz="12" w:space="6" w:color="C8102E"/>
+        </w:pBdr>
+        <w:spacing w:before="560" w:after="200" w:line="281" w:lineRule="auto"/>
+      </w:pPr>
+      <w:bookmarkStart w:id="100011" w:name="windows"/>
+      <w:bookmarkEnd w:id="100011"/>
+      <w:r>
+        <w:t xml:space="preserve">Windows</w:t>
+      </w:r>
+    </w:p>
+    <w:p>
+      <w:pPr>
+        <w:spacing w:after="160" w:line="259" w:lineRule="auto"/>
+      </w:pPr>
+      <w:r>
+        <w:t xml:space="preserve">Windows have a title bar with three </w:t>
+      </w:r>
+      <w:r>
+        <w:rPr>
+          <w:b/>
+          <w:bCs/>
+        </w:rPr>
+        <w:t xml:space="preserve">macOS-style colored circle buttons</w:t>
+      </w:r>
+      <w:r>
+        <w:t xml:space="preserve"> on the left — close, minimize, maximize.</w:t>
+      </w:r>
+    </w:p>
+    <w:p>
+      <w:pPr>
+        <w:numPr>
+          <w:ilvl w:val="0"/>
+          <w:numId w:val="1"/>
+        </w:numPr>
+        <w:spacing w:after="160" w:line="259" w:lineRule="auto"/>
+      </w:pPr>
+      <w:r>
+        <w:rPr>
+          <w:b/>
+          <w:bCs/>
+        </w:rPr>
+        <w:t xml:space="preserve">Drag the title bar</w:t>
+      </w:r>
+      <w:r>
+        <w:t xml:space="preserve"> to move a window.</w:t>
+      </w:r>
+    </w:p>
+    <w:p>
+      <w:pPr>
+        <w:numPr>
+          <w:ilvl w:val="0"/>
+          <w:numId w:val="1"/>
+        </w:numPr>
+        <w:spacing w:after="160" w:line="259" w:lineRule="auto"/>
+      </w:pPr>
+      <w:r>
+        <w:rPr>
+          <w:b/>
+          <w:bCs/>
+        </w:rPr>
+        <w:t xml:space="preserve">Drag an edge or corner</w:t>
+      </w:r>
+      <w:r>
+        <w:t xml:space="preserve"> to resize it.</w:t>
+      </w:r>
+    </w:p>
+    <w:p>
+      <w:pPr>
+        <w:numPr>
+          <w:ilvl w:val="0"/>
+          <w:numId w:val="1"/>
+        </w:numPr>
+        <w:spacing w:after="160" w:line="259" w:lineRule="auto"/>
+      </w:pPr>
+      <w:r>
+        <w:rPr>
+          <w:b/>
+          <w:bCs/>
+        </w:rPr>
+        <w:t xml:space="preserve">Double-click the title bar</w:t>
+      </w:r>
+      <w:r>
+        <w:t xml:space="preserve"> to toggle maximized.</w:t>
+      </w:r>
+    </w:p>
+    <w:p>
+      <w:pPr>
+        <w:numPr>
+          <w:ilvl w:val="0"/>
+          <w:numId w:val="1"/>
+        </w:numPr>
+        <w:spacing w:after="160" w:line="259" w:lineRule="auto"/>
+      </w:pPr>
+      <w:r>
+        <w:t xml:space="preserve">The </w:t>
+      </w:r>
+      <w:r>
+        <w:rPr>
+          <w:b/>
+          <w:bCs/>
+        </w:rPr>
+        <w:t xml:space="preserve">maximize</w:t>
+      </w:r>
+      <w:r>
+        <w:t xml:space="preserve"> button does the same.</w:t>
+      </w:r>
+    </w:p>
+    <w:p>
+      <w:pPr>
+        <w:spacing w:after="160" w:line="259" w:lineRule="auto"/>
+      </w:pPr>
+      <w:r>
+        <w:t xml:space="preserve">By default windows </w:t>
+      </w:r>
+      <w:r>
+        <w:rPr>
+          <w:b/>
+          <w:bCs/>
+        </w:rPr>
+        <w:t xml:space="preserve">float</w:t>
+      </w:r>
+      <w:r>
+        <w:t xml:space="preserve"> — you place them freely. You can switch the whole desktop to </w:t>
+      </w:r>
+      <w:r>
+        <w:rPr>
+          <w:b/>
+          <w:bCs/>
+        </w:rPr>
+        <w:t xml:space="preserve">tiling</w:t>
+      </w:r>
+      <w:r>
+        <w:t xml:space="preserve"> (a dwm-style master-and-stack layout, where windows share the screen automatically) with the </w:t>
+      </w:r>
+      <w:r>
+        <w:rPr>
+          <w:b/>
+          <w:bCs/>
+        </w:rPr>
+        <w:t xml:space="preserve">Tiling</w:t>
+      </w:r>
+      <w:r>
+        <w:t xml:space="preserve"> tile in the </w:t>
+      </w:r>
+      <w:hyperlink w:anchor="the-menu-bar">
+        <w:r>
+          <w:rPr>
+            <w:rStyle w:val="Hyperlink"/>
+          </w:rPr>
+          <w:t xml:space="preserve">control centre</w:t>
+        </w:r>
+      </w:hyperlink>
+      <w:r>
+        <w:t xml:space="preserve">, or the </w:t>
+      </w:r>
+      <w:r>
+        <w:rPr>
+          <w:b/>
+          <w:bCs/>
+        </w:rPr>
+        <w:t xml:space="preserve">Tiling Windows</w:t>
+      </w:r>
+      <w:r>
+        <w:t xml:space="preserve"> switch in </w:t>
+      </w:r>
+      <w:hyperlink w:anchor="settings">
+        <w:r>
+          <w:rPr>
+            <w:rStyle w:val="Hyperlink"/>
+          </w:rPr>
+          <w:t xml:space="preserve">Settings</w:t>
+        </w:r>
+      </w:hyperlink>
+      <w:r>
+        <w:t xml:space="preserve">. Toggling it back restores your floating layout.</w:t>
+      </w:r>
+    </w:p>
+    <w:p>
+      <w:pPr>
+        <w:pStyle w:val="Heading1"/>
+        <w:keepNext/>
+        <w:keepLines/>
+        <w:pageBreakBefore/>
+        <w:pBdr>
+          <w:bottom w:val="single" w:sz="12" w:space="6" w:color="C8102E"/>
+        </w:pBdr>
+        <w:spacing w:before="560" w:after="200" w:line="281" w:lineRule="auto"/>
+      </w:pPr>
+      <w:bookmarkStart w:id="100012" w:name="spaces-and-mission-control"/>
+      <w:bookmarkEnd w:id="100012"/>
+      <w:r>
+        <w:t xml:space="preserve">Spaces and Mission Control</w:t>
+      </w:r>
+    </w:p>
+    <w:p>
+      <w:pPr>
+        <w:pageBreakBefore/>
+        <w:spacing w:after="160" w:line="259" w:lineRule="auto"/>
+      </w:pPr>
+      <w:r>
+        <w:t xml:space="preserve">Starling has </w:t>
+      </w:r>
+      <w:r>
+        <w:rPr>
+          <w:b/>
+          <w:bCs/>
+        </w:rPr>
+        <w:t xml:space="preserve">spaces</w:t>
+      </w:r>
+      <w:r>
+        <w:t xml:space="preserve"> (virtual desktops) and a </w:t>
+      </w:r>
+      <w:r>
+        <w:rPr>
+          <w:b/>
+          <w:bCs/>
+        </w:rPr>
+        <w:t xml:space="preserve">Mission Control</w:t>
+      </w:r>
+      <w:r>
+        <w:t xml:space="preserve"> overview, driven from the keyboard the way macOS does it.</w:t>
       </w:r>
     </w:p>
     <w:tbl>
@@ -1655,7 +1987,7 @@
                 <w:b/>
                 <w:bCs/>
               </w:rPr>
-              <w:t xml:space="preserve">Shortcut</w:t>
+              <w:t xml:space="preserve">Do this</w:t>
             </w:r>
           </w:p>
         </w:tc>
@@ -1672,7 +2004,7 @@
                 <w:b/>
                 <w:bCs/>
               </w:rPr>
-              <w:t xml:space="preserve">Action</w:t>
+              <w:t xml:space="preserve">To</w:t>
             </w:r>
           </w:p>
         </w:tc>
@@ -1701,7 +2033,7 @@
                 <w:b/>
                 <w:bCs/>
               </w:rPr>
-              <w:t xml:space="preserve">←</w:t>
+              <w:t xml:space="preserve">Ctrl + ←</w:t>
             </w:r>
           </w:p>
         </w:tc>
@@ -1714,7 +2046,7 @@
               <w:spacing w:after="160" w:line="259" w:lineRule="auto"/>
             </w:pPr>
             <w:r>
-              <w:t xml:space="preserve">Adjacent space</w:t>
+              <w:t xml:space="preserve">Slide to the next / previous space</w:t>
             </w:r>
           </w:p>
         </w:tc>
@@ -1756,7 +2088,7 @@
               <w:spacing w:after="160" w:line="259" w:lineRule="auto"/>
             </w:pPr>
             <w:r>
-              <w:t xml:space="preserve">Move focused window to adjacent space</w:t>
+              <w:t xml:space="preserve">Carry the focused window to the next / previous space</w:t>
             </w:r>
           </w:p>
         </w:tc>
@@ -1788,7 +2120,7 @@
               <w:spacing w:after="160" w:line="259" w:lineRule="auto"/>
             </w:pPr>
             <w:r>
-              <w:t xml:space="preserve">Cycle spaces</w:t>
+              <w:t xml:space="preserve">Cycle through your spaces</w:t>
             </w:r>
           </w:p>
         </w:tc>
@@ -1820,7 +2152,17 @@
               <w:spacing w:after="160" w:line="259" w:lineRule="auto"/>
             </w:pPr>
             <w:r>
+              <w:t xml:space="preserve">Open </w:t>
+            </w:r>
+            <w:r>
+              <w:rPr>
+                <w:b/>
+                <w:bCs/>
+              </w:rPr>
               <w:t xml:space="preserve">Mission Control</w:t>
+            </w:r>
+            <w:r>
+              <w:t xml:space="preserve"> (all spaces and windows at once)</w:t>
             </w:r>
           </w:p>
         </w:tc>
@@ -1852,7 +2194,28 @@
               <w:spacing w:after="160" w:line="259" w:lineRule="auto"/>
             </w:pPr>
             <w:r>
-              <w:t xml:space="preserve">Workspace mode</w:t>
+              <w:t xml:space="preserve">Open your </w:t>
+            </w:r>
+            <w:r>
+              <w:rPr>
+                <w:b/>
+                <w:bCs/>
+              </w:rPr>
+              <w:t xml:space="preserve">workspace</w:t>
+            </w:r>
+            <w:r>
+              <w:t xml:space="preserve"> (see </w:t>
+            </w:r>
+            <w:hyperlink w:anchor="workspaces-a-desktop-for-your-agent">
+              <w:r>
+                <w:rPr>
+                  <w:rStyle w:val="Hyperlink"/>
+                </w:rPr>
+                <w:t xml:space="preserve">Workspaces</w:t>
+              </w:r>
+            </w:hyperlink>
+            <w:r>
+              <w:t xml:space="preserve">)</w:t>
             </w:r>
           </w:p>
         </w:tc>
@@ -1871,7 +2234,7 @@
                 <w:b/>
                 <w:bCs/>
               </w:rPr>
-              <w:t xml:space="preserve">Ctrl + Shift + R</w:t>
+              <w:t xml:space="preserve">Esc</w:t>
             </w:r>
           </w:p>
         </w:tc>
@@ -1884,7 +2247,254 @@
               <w:spacing w:after="160" w:line="259" w:lineRule="auto"/>
             </w:pPr>
             <w:r>
-              <w:t xml:space="preserve">Start / stop screen recording</w:t>
+              <w:t xml:space="preserve">Close Mission Control</w:t>
+            </w:r>
+          </w:p>
+        </w:tc>
+      </w:tr>
+    </w:tbl>
+    <w:p>
+      <w:pPr>
+        <w:spacing w:after="160" w:line="259" w:lineRule="auto"/>
+      </w:pPr>
+      <w:r>
+        <w:t xml:space="preserve">In Mission Control, </w:t>
+      </w:r>
+      <w:r>
+        <w:rPr>
+          <w:b/>
+          <w:bCs/>
+        </w:rPr>
+        <w:t xml:space="preserve">Ctrl + ← / →</w:t>
+      </w:r>
+      <w:r>
+        <w:t xml:space="preserve"> retargets the active space instantly. To add a space, right-click the wallpaper and choose </w:t>
+      </w:r>
+      <w:r>
+        <w:rPr>
+          <w:b/>
+          <w:bCs/>
+        </w:rPr>
+        <w:t xml:space="preserve">New Desktop</w:t>
+      </w:r>
+      <w:r>
+        <w:t xml:space="preserve">.</w:t>
+      </w:r>
+    </w:p>
+    <w:p>
+      <w:pPr>
+        <w:spacing w:after="160" w:line="259" w:lineRule="auto"/>
+      </w:pPr>
+      <w:r>
+        <w:rPr>
+          <w:rFonts w:ascii="Liberation Mono" w:hAnsi="Liberation Mono" w:cs="Liberation Mono"/>
+        </w:rPr>
+        <w:t xml:space="preserve">Ctrl</w:t>
+      </w:r>
+      <w:r>
+        <w:t xml:space="preserve"> + arrows belong to the system — apps never see them — so they work no matter which window is focused.</w:t>
+      </w:r>
+    </w:p>
+    <w:p>
+      <w:pPr>
+        <w:pStyle w:val="Heading1"/>
+        <w:keepNext/>
+        <w:keepLines/>
+        <w:pageBreakBefore/>
+        <w:pBdr>
+          <w:bottom w:val="single" w:sz="12" w:space="6" w:color="C8102E"/>
+        </w:pBdr>
+        <w:spacing w:before="560" w:after="200" w:line="281" w:lineRule="auto"/>
+      </w:pPr>
+      <w:bookmarkStart w:id="100013" w:name="right-click-the-desktop"/>
+      <w:bookmarkEnd w:id="100013"/>
+      <w:r>
+        <w:t xml:space="preserve">Right-click the desktop</w:t>
+      </w:r>
+    </w:p>
+    <w:p>
+      <w:pPr>
+        <w:pageBreakBefore/>
+        <w:spacing w:after="160" w:line="259" w:lineRule="auto"/>
+      </w:pPr>
+      <w:r>
+        <w:t xml:space="preserve">Right-click anywhere on the wallpaper for the desktop menu:</w:t>
+      </w:r>
+    </w:p>
+    <w:p>
+      <w:pPr>
+        <w:numPr>
+          <w:ilvl w:val="0"/>
+          <w:numId w:val="1"/>
+        </w:numPr>
+        <w:spacing w:after="160" w:line="259" w:lineRule="auto"/>
+      </w:pPr>
+      <w:r>
+        <w:rPr>
+          <w:b/>
+          <w:bCs/>
+        </w:rPr>
+        <w:t xml:space="preserve">Change Wallpaper</w:t>
+      </w:r>
+    </w:p>
+    <w:p>
+      <w:pPr>
+        <w:numPr>
+          <w:ilvl w:val="0"/>
+          <w:numId w:val="1"/>
+        </w:numPr>
+        <w:spacing w:after="160" w:line="259" w:lineRule="auto"/>
+      </w:pPr>
+      <w:r>
+        <w:rPr>
+          <w:b/>
+          <w:bCs/>
+        </w:rPr>
+        <w:t xml:space="preserve">Mission Control</w:t>
+      </w:r>
+    </w:p>
+    <w:p>
+      <w:pPr>
+        <w:numPr>
+          <w:ilvl w:val="0"/>
+          <w:numId w:val="1"/>
+        </w:numPr>
+        <w:spacing w:after="160" w:line="259" w:lineRule="auto"/>
+      </w:pPr>
+      <w:r>
+        <w:rPr>
+          <w:b/>
+          <w:bCs/>
+        </w:rPr>
+        <w:t xml:space="preserve">New Desktop</w:t>
+      </w:r>
+      <w:r>
+        <w:t xml:space="preserve"> — add a space</w:t>
+      </w:r>
+    </w:p>
+    <w:p>
+      <w:pPr>
+        <w:numPr>
+          <w:ilvl w:val="0"/>
+          <w:numId w:val="1"/>
+        </w:numPr>
+        <w:spacing w:after="160" w:line="259" w:lineRule="auto"/>
+      </w:pPr>
+      <w:r>
+        <w:rPr>
+          <w:b/>
+          <w:bCs/>
+        </w:rPr>
+        <w:t xml:space="preserve">Workspace</w:t>
+      </w:r>
+    </w:p>
+    <w:p>
+      <w:pPr>
+        <w:numPr>
+          <w:ilvl w:val="0"/>
+          <w:numId w:val="1"/>
+        </w:numPr>
+        <w:spacing w:after="160" w:line="259" w:lineRule="auto"/>
+      </w:pPr>
+      <w:r>
+        <w:t xml:space="preserve">switch </w:t>
+      </w:r>
+      <w:r>
+        <w:rPr>
+          <w:b/>
+          <w:bCs/>
+        </w:rPr>
+        <w:t xml:space="preserve">appearance</w:t>
+      </w:r>
+      <w:r>
+        <w:t xml:space="preserve"> (light / dark)</w:t>
+      </w:r>
+    </w:p>
+    <w:p>
+      <w:pPr>
+        <w:numPr>
+          <w:ilvl w:val="0"/>
+          <w:numId w:val="1"/>
+        </w:numPr>
+        <w:spacing w:after="160" w:line="259" w:lineRule="auto"/>
+      </w:pPr>
+      <w:r>
+        <w:rPr>
+          <w:b/>
+          <w:bCs/>
+        </w:rPr>
+        <w:t xml:space="preserve">Remove This Desktop</w:t>
+      </w:r>
+      <w:r>
+        <w:t xml:space="preserve"> — when you have more than one</w:t>
+      </w:r>
+    </w:p>
+    <w:p>
+      <w:pPr>
+        <w:pStyle w:val="Heading1"/>
+        <w:keepNext/>
+        <w:keepLines/>
+        <w:pageBreakBefore/>
+        <w:pBdr>
+          <w:bottom w:val="single" w:sz="12" w:space="6" w:color="C8102E"/>
+        </w:pBdr>
+        <w:spacing w:before="560" w:after="200" w:line="281" w:lineRule="auto"/>
+      </w:pPr>
+      <w:bookmarkStart w:id="100014" w:name="keyboard-shortcuts"/>
+      <w:bookmarkEnd w:id="100014"/>
+      <w:r>
+        <w:t xml:space="preserve">Keyboard shortcuts</w:t>
+      </w:r>
+    </w:p>
+    <w:tbl>
+      <w:tblPr>
+        <w:tblW w:w="0" w:type="auto"/>
+        <w:tblBorders>
+          <w:top w:val="single" w:sz="4" w:space="0" w:color="auto"/>
+          <w:left w:val="single" w:sz="4" w:space="0" w:color="auto"/>
+          <w:bottom w:val="single" w:sz="4" w:space="0" w:color="auto"/>
+          <w:right w:val="single" w:sz="4" w:space="0" w:color="auto"/>
+          <w:insideH w:val="single" w:sz="4" w:space="0" w:color="auto"/>
+          <w:insideV w:val="single" w:sz="4" w:space="0" w:color="auto"/>
+        </w:tblBorders>
+        <w:tblLook w:val="04A0"/>
+      </w:tblPr>
+      <w:tblGrid>
+        <w:gridCol w:w="4680"/>
+        <w:gridCol w:w="4680"/>
+      </w:tblGrid>
+      <w:tr>
+        <w:tc>
+          <w:tcPr>
+            <w:tcW w:w="4680" w:type="dxa"/>
+          </w:tcPr>
+          <w:p>
+            <w:pPr>
+              <w:spacing w:after="160" w:line="259" w:lineRule="auto"/>
+            </w:pPr>
+            <w:r>
+              <w:rPr>
+                <w:b/>
+                <w:bCs/>
+              </w:rPr>
+              <w:t xml:space="preserve">Shortcut</w:t>
+            </w:r>
+          </w:p>
+        </w:tc>
+        <w:tc>
+          <w:tcPr>
+            <w:tcW w:w="4680" w:type="dxa"/>
+          </w:tcPr>
+          <w:p>
+            <w:pPr>
+              <w:spacing w:after="160" w:line="259" w:lineRule="auto"/>
+            </w:pPr>
+            <w:r>
+              <w:rPr>
+                <w:b/>
+                <w:bCs/>
+              </w:rPr>
+              <w:t xml:space="preserve">Action</w:t>
             </w:r>
           </w:p>
         </w:tc>
@@ -1903,7 +2513,17 @@
                 <w:b/>
                 <w:bCs/>
               </w:rPr>
-              <w:t xml:space="preserve">Ctrl + Shift + S</w:t>
+              <w:t xml:space="preserve">Ctrl + →</w:t>
+            </w:r>
+            <w:r>
+              <w:t xml:space="preserve"> / </w:t>
+            </w:r>
+            <w:r>
+              <w:rPr>
+                <w:b/>
+                <w:bCs/>
+              </w:rPr>
+              <w:t xml:space="preserve">←</w:t>
             </w:r>
           </w:p>
         </w:tc>
@@ -1916,8 +2536,16 @@
               <w:spacing w:after="160" w:line="259" w:lineRule="auto"/>
             </w:pPr>
             <w:r>
-              <w:t xml:space="preserve">Show the screensaver now</w:t>
-            </w:r>
+              <w:t xml:space="preserve">Adjacent </w:t>
+            </w:r>
+            <w:hyperlink w:anchor="spaces-and-mission-control">
+              <w:r>
+                <w:rPr>
+                  <w:rStyle w:val="Hyperlink"/>
+                </w:rPr>
+                <w:t xml:space="preserve">space</w:t>
+              </w:r>
+            </w:hyperlink>
           </w:p>
         </w:tc>
       </w:tr>
@@ -1935,7 +2563,17 @@
                 <w:b/>
                 <w:bCs/>
               </w:rPr>
-              <w:t xml:space="preserve">Ctrl + Space</w:t>
+              <w:t xml:space="preserve">Ctrl + Shift + →</w:t>
+            </w:r>
+            <w:r>
+              <w:t xml:space="preserve"> / </w:t>
+            </w:r>
+            <w:r>
+              <w:rPr>
+                <w:b/>
+                <w:bCs/>
+              </w:rPr>
+              <w:t xml:space="preserve">←</w:t>
             </w:r>
           </w:p>
         </w:tc>
@@ -1948,7 +2586,7 @@
               <w:spacing w:after="160" w:line="259" w:lineRule="auto"/>
             </w:pPr>
             <w:r>
-              <w:t xml:space="preserve">Toggle the input method (fcitx5, for CJK and other IME input)</w:t>
+              <w:t xml:space="preserve">Move focused window to adjacent space</w:t>
             </w:r>
           </w:p>
         </w:tc>
@@ -1967,7 +2605,7 @@
                 <w:b/>
                 <w:bCs/>
               </w:rPr>
-              <w:t xml:space="preserve">Esc</w:t>
+              <w:t xml:space="preserve">Ctrl + Tab</w:t>
             </w:r>
           </w:p>
         </w:tc>
@@ -1980,7 +2618,7 @@
               <w:spacing w:after="160" w:line="259" w:lineRule="auto"/>
             </w:pPr>
             <w:r>
-              <w:t xml:space="preserve">Close Mission Control; release a taken-over agent window</w:t>
+              <w:t xml:space="preserve">Cycle spaces</w:t>
             </w:r>
           </w:p>
         </w:tc>
@@ -1995,7 +2633,11 @@
               <w:spacing w:after="160" w:line="259" w:lineRule="auto"/>
             </w:pPr>
             <w:r>
-              <w:t xml:space="preserve">Double-click title bar</w:t>
+              <w:rPr>
+                <w:b/>
+                <w:bCs/>
+              </w:rPr>
+              <w:t xml:space="preserve">Ctrl + ↑</w:t>
             </w:r>
           </w:p>
         </w:tc>
@@ -2007,13 +2649,261 @@
             <w:pPr>
               <w:spacing w:after="160" w:line="259" w:lineRule="auto"/>
             </w:pPr>
-            <w:r>
-              <w:t xml:space="preserve">Maximize / restore a window</w:t>
-            </w:r>
+            <w:hyperlink w:anchor="spaces-and-mission-control">
+              <w:r>
+                <w:rPr>
+                  <w:rStyle w:val="Hyperlink"/>
+                </w:rPr>
+                <w:t xml:space="preserve">Mission Control</w:t>
+              </w:r>
+            </w:hyperlink>
+          </w:p>
+        </w:tc>
+      </w:tr>
+      <w:tr>
+        <w:tc>
+          <w:tcPr>
+            <w:tcW w:w="4680" w:type="dxa"/>
+          </w:tcPr>
+          <w:p>
+            <w:pPr>
+              <w:spacing w:after="160" w:line="259" w:lineRule="auto"/>
+            </w:pPr>
+            <w:r>
+              <w:rPr>
+                <w:b/>
+                <w:bCs/>
+              </w:rPr>
+              <w:t xml:space="preserve">Ctrl + ↓</w:t>
+            </w:r>
+          </w:p>
+        </w:tc>
+        <w:tc>
+          <w:tcPr>
+            <w:tcW w:w="4680" w:type="dxa"/>
+          </w:tcPr>
+          <w:p>
+            <w:pPr>
+              <w:spacing w:after="160" w:line="259" w:lineRule="auto"/>
+            </w:pPr>
+            <w:hyperlink w:anchor="workspaces-a-desktop-for-your-agent">
+              <w:r>
+                <w:rPr>
+                  <w:rStyle w:val="Hyperlink"/>
+                </w:rPr>
+                <w:t xml:space="preserve">Workspace mode</w:t>
+              </w:r>
+            </w:hyperlink>
+          </w:p>
+        </w:tc>
+      </w:tr>
+      <w:tr>
+        <w:tc>
+          <w:tcPr>
+            <w:tcW w:w="4680" w:type="dxa"/>
+          </w:tcPr>
+          <w:p>
+            <w:pPr>
+              <w:spacing w:after="160" w:line="259" w:lineRule="auto"/>
+            </w:pPr>
+            <w:r>
+              <w:rPr>
+                <w:b/>
+                <w:bCs/>
+              </w:rPr>
+              <w:t xml:space="preserve">Ctrl + Shift + R</w:t>
+            </w:r>
+          </w:p>
+        </w:tc>
+        <w:tc>
+          <w:tcPr>
+            <w:tcW w:w="4680" w:type="dxa"/>
+          </w:tcPr>
+          <w:p>
+            <w:pPr>
+              <w:spacing w:after="160" w:line="259" w:lineRule="auto"/>
+            </w:pPr>
+            <w:r>
+              <w:t xml:space="preserve">Start / stop </w:t>
+            </w:r>
+            <w:hyperlink w:anchor="recording-the-screen">
+              <w:r>
+                <w:rPr>
+                  <w:rStyle w:val="Hyperlink"/>
+                </w:rPr>
+                <w:t xml:space="preserve">screen recording</w:t>
+              </w:r>
+            </w:hyperlink>
+          </w:p>
+        </w:tc>
+      </w:tr>
+      <w:tr>
+        <w:tc>
+          <w:tcPr>
+            <w:tcW w:w="4680" w:type="dxa"/>
+          </w:tcPr>
+          <w:p>
+            <w:pPr>
+              <w:spacing w:after="160" w:line="259" w:lineRule="auto"/>
+            </w:pPr>
+            <w:r>
+              <w:rPr>
+                <w:b/>
+                <w:bCs/>
+              </w:rPr>
+              <w:t xml:space="preserve">Ctrl + Shift + S</w:t>
+            </w:r>
+          </w:p>
+        </w:tc>
+        <w:tc>
+          <w:tcPr>
+            <w:tcW w:w="4680" w:type="dxa"/>
+          </w:tcPr>
+          <w:p>
+            <w:pPr>
+              <w:spacing w:after="160" w:line="259" w:lineRule="auto"/>
+            </w:pPr>
+            <w:r>
+              <w:t xml:space="preserve">Show the </w:t>
+            </w:r>
+            <w:hyperlink w:anchor="the-screensaver">
+              <w:r>
+                <w:rPr>
+                  <w:rStyle w:val="Hyperlink"/>
+                </w:rPr>
+                <w:t xml:space="preserve">screensaver</w:t>
+              </w:r>
+            </w:hyperlink>
+            <w:r>
+              <w:t xml:space="preserve"> now</w:t>
+            </w:r>
+          </w:p>
+        </w:tc>
+      </w:tr>
+      <w:tr>
+        <w:tc>
+          <w:tcPr>
+            <w:tcW w:w="4680" w:type="dxa"/>
+          </w:tcPr>
+          <w:p>
+            <w:pPr>
+              <w:spacing w:after="160" w:line="259" w:lineRule="auto"/>
+            </w:pPr>
+            <w:r>
+              <w:rPr>
+                <w:b/>
+                <w:bCs/>
+              </w:rPr>
+              <w:t xml:space="preserve">Ctrl + Space</w:t>
+            </w:r>
+          </w:p>
+        </w:tc>
+        <w:tc>
+          <w:tcPr>
+            <w:tcW w:w="4680" w:type="dxa"/>
+          </w:tcPr>
+          <w:p>
+            <w:pPr>
+              <w:spacing w:after="160" w:line="259" w:lineRule="auto"/>
+            </w:pPr>
+            <w:r>
+              <w:t xml:space="preserve">Toggle the input method (fcitx5, for CJK and other IME input)</w:t>
+            </w:r>
+          </w:p>
+        </w:tc>
+      </w:tr>
+      <w:tr>
+        <w:tc>
+          <w:tcPr>
+            <w:tcW w:w="4680" w:type="dxa"/>
+          </w:tcPr>
+          <w:p>
+            <w:pPr>
+              <w:spacing w:after="160" w:line="259" w:lineRule="auto"/>
+            </w:pPr>
+            <w:r>
+              <w:rPr>
+                <w:b/>
+                <w:bCs/>
+              </w:rPr>
+              <w:t xml:space="preserve">Esc</w:t>
+            </w:r>
+          </w:p>
+        </w:tc>
+        <w:tc>
+          <w:tcPr>
+            <w:tcW w:w="4680" w:type="dxa"/>
+          </w:tcPr>
+          <w:p>
+            <w:pPr>
+              <w:spacing w:after="160" w:line="259" w:lineRule="auto"/>
+            </w:pPr>
+            <w:r>
+              <w:t xml:space="preserve">Close Mission Control; release a taken-over </w:t>
+            </w:r>
+            <w:hyperlink w:anchor="workspaces-a-desktop-for-your-agent">
+              <w:r>
+                <w:rPr>
+                  <w:rStyle w:val="Hyperlink"/>
+                </w:rPr>
+                <w:t xml:space="preserve">agent window</w:t>
+              </w:r>
+            </w:hyperlink>
+          </w:p>
+        </w:tc>
+      </w:tr>
+      <w:tr>
+        <w:tc>
+          <w:tcPr>
+            <w:tcW w:w="4680" w:type="dxa"/>
+          </w:tcPr>
+          <w:p>
+            <w:pPr>
+              <w:spacing w:after="160" w:line="259" w:lineRule="auto"/>
+            </w:pPr>
+            <w:r>
+              <w:t xml:space="preserve">Double-click title bar</w:t>
+            </w:r>
+          </w:p>
+        </w:tc>
+        <w:tc>
+          <w:tcPr>
+            <w:tcW w:w="4680" w:type="dxa"/>
+          </w:tcPr>
+          <w:p>
+            <w:pPr>
+              <w:spacing w:after="160" w:line="259" w:lineRule="auto"/>
+            </w:pPr>
+            <w:r>
+              <w:t xml:space="preserve">Maximize / restore a </w:t>
+            </w:r>
+            <w:hyperlink w:anchor="windows">
+              <w:r>
+                <w:rPr>
+                  <w:rStyle w:val="Hyperlink"/>
+                </w:rPr>
+                <w:t xml:space="preserve">window</w:t>
+              </w:r>
+            </w:hyperlink>
           </w:p>
         </w:tc>
       </w:tr>
     </w:tbl>
+    <w:p>
+      <w:pPr>
+        <w:pageBreakBefore/>
+        <w:spacing w:after="160" w:line="259" w:lineRule="auto"/>
+      </w:pPr>
+      <w:r>
+        <w:rPr>
+          <w:rFonts w:ascii="Liberation Mono" w:hAnsi="Liberation Mono" w:cs="Liberation Mono"/>
+        </w:rPr>
+        <w:t xml:space="preserve">Ctrl</w:t>
+      </w:r>
+      <w:r>
+        <w:t xml:space="preserve"> + arrows belong to the system — apps never see them — so they work no matter which window is focused.</w:t>
+      </w:r>
+    </w:p>
     <w:p>
       <w:pPr>
         <w:pStyle w:val="Heading1"/>
@@ -2025,6 +2915,8 @@
         </w:pBdr>
         <w:spacing w:before="560" w:after="200" w:line="281" w:lineRule="auto"/>
       </w:pPr>
+      <w:bookmarkStart w:id="100015" w:name="the-apps"/>
+      <w:bookmarkEnd w:id="100015"/>
       <w:r>
         <w:t xml:space="preserve">The apps</w:t>
       </w:r>
@@ -2054,7 +2946,18 @@
         <w:t xml:space="preserve">Settings</w:t>
       </w:r>
       <w:r>
-        <w:t xml:space="preserve"> — appearance, displays, network, sound, and system information. See below.</w:t>
+        <w:t xml:space="preserve"> — appearance, displays, network, sound, and system information. See </w:t>
+      </w:r>
+      <w:hyperlink w:anchor="settings">
+        <w:r>
+          <w:rPr>
+            <w:rStyle w:val="Hyperlink"/>
+          </w:rPr>
+          <w:t xml:space="preserve">Settings</w:t>
+        </w:r>
+      </w:hyperlink>
+      <w:r>
+        <w:t xml:space="preserve">.</w:t>
       </w:r>
     </w:p>
     <w:p>
@@ -2119,7 +3022,18 @@
         <w:t xml:space="preserve">htop</w:t>
       </w:r>
       <w:r>
-        <w:t xml:space="preserve"> work.</w:t>
+        <w:t xml:space="preserve"> work. If it ever draws the wrong thing, see </w:t>
+      </w:r>
+      <w:hyperlink w:anchor="when-the-terminal-draws-the-wrong-thing">
+        <w:r>
+          <w:rPr>
+            <w:rStyle w:val="Hyperlink"/>
+          </w:rPr>
+          <w:t xml:space="preserve">When the terminal draws the wrong thing</w:t>
+        </w:r>
+      </w:hyperlink>
+      <w:r>
+        <w:t xml:space="preserve">.</w:t>
       </w:r>
     </w:p>
     <w:p>
@@ -2176,7 +3090,18 @@
         <w:t xml:space="preserve">App Store</w:t>
       </w:r>
       <w:r>
-        <w:t xml:space="preserve"> — install more applications. See below.</w:t>
+        <w:t xml:space="preserve"> — install more applications. See </w:t>
+      </w:r>
+      <w:hyperlink w:anchor="installing-more-apps">
+        <w:r>
+          <w:rPr>
+            <w:rStyle w:val="Hyperlink"/>
+          </w:rPr>
+          <w:t xml:space="preserve">Installing more apps</w:t>
+        </w:r>
+      </w:hyperlink>
+      <w:r>
+        <w:t xml:space="preserve">.</w:t>
       </w:r>
     </w:p>
     <w:p>
@@ -2247,6 +3172,8 @@
         </w:pBdr>
         <w:spacing w:before="560" w:after="200" w:line="281" w:lineRule="auto"/>
       </w:pPr>
+      <w:bookmarkStart w:id="100016" w:name="settings"/>
+      <w:bookmarkEnd w:id="100016"/>
       <w:r>
         <w:t xml:space="preserve">Settings</w:t>
       </w:r>
@@ -2344,7 +3271,18 @@
         <w:t xml:space="preserve">scaling is pinned to 2.0</w:t>
       </w:r>
       <w:r>
-        <w:t xml:space="preserve"> in this release, and there is no display-mode selection yet.</w:t>
+        <w:t xml:space="preserve"> in this release, and there is no display-mode selection yet (see </w:t>
+      </w:r>
+      <w:hyperlink w:anchor="things-to-know-in-this-release">
+        <w:r>
+          <w:rPr>
+            <w:rStyle w:val="Hyperlink"/>
+          </w:rPr>
+          <w:t xml:space="preserve">Things to know in this release</w:t>
+        </w:r>
+      </w:hyperlink>
+      <w:r>
+        <w:t xml:space="preserve">).</w:t>
       </w:r>
     </w:p>
     <w:p>
@@ -2440,15 +3378,27 @@
         <w:t xml:space="preserve">Tiling Windows</w:t>
       </w:r>
       <w:r>
-        <w:t xml:space="preserve"> to switch between floating and tiling window management, the wallpaper picker, the </w:t>
-      </w:r>
-      <w:r>
-        <w:rPr>
-          <w:b/>
-          <w:bCs/>
-        </w:rPr>
-        <w:t xml:space="preserve">Screensaver</w:t>
-      </w:r>
+        <w:t xml:space="preserve"> to switch between floating and tiling window management (see </w:t>
+      </w:r>
+      <w:hyperlink w:anchor="windows">
+        <w:r>
+          <w:rPr>
+            <w:rStyle w:val="Hyperlink"/>
+          </w:rPr>
+          <w:t xml:space="preserve">Windows</w:t>
+        </w:r>
+      </w:hyperlink>
+      <w:r>
+        <w:t xml:space="preserve">), the wallpaper picker, the </w:t>
+      </w:r>
+      <w:hyperlink w:anchor="the-screensaver">
+        <w:r>
+          <w:rPr>
+            <w:rStyle w:val="Hyperlink"/>
+          </w:rPr>
+          <w:t xml:space="preserve">**Screensaver**</w:t>
+        </w:r>
+      </w:hyperlink>
       <w:r>
         <w:t xml:space="preserve"> idle time, and a </w:t>
       </w:r>
@@ -2512,6 +3462,8 @@
         </w:pBdr>
         <w:spacing w:before="560" w:after="200" w:line="281" w:lineRule="auto"/>
       </w:pPr>
+      <w:bookmarkStart w:id="100017" w:name="installing-more-apps"/>
+      <w:bookmarkEnd w:id="100017"/>
       <w:r>
         <w:t xml:space="preserve">Installing more apps</w:t>
       </w:r>
@@ -2522,7 +3474,7 @@
         <w:spacing w:after="160" w:line="259" w:lineRule="auto"/>
       </w:pPr>
       <w:r>
-        <w:t xml:space="preserve">Starling launches applications that are installed on your machine — it does not bundle them. Two ways to add them:</w:t>
+        <w:t xml:space="preserve">Starling launches applications that are installed on your machine — it does not bundle them. Three ways to add them:</w:t>
       </w:r>
     </w:p>
     <w:p>
@@ -2532,6 +3484,8 @@
         <w:keepLines/>
         <w:spacing w:before="280" w:after="80" w:line="281" w:lineRule="auto"/>
       </w:pPr>
+      <w:bookmarkStart w:id="100018" w:name="through-the-app-store"/>
+      <w:bookmarkEnd w:id="100018"/>
       <w:r>
         <w:t xml:space="preserve">Through the App Store</w:t>
       </w:r>
@@ -2641,6 +3595,72 @@
         <w:keepLines/>
         <w:spacing w:before="280" w:after="80" w:line="281" w:lineRule="auto"/>
       </w:pPr>
+      <w:bookmarkStart w:id="100019" w:name="from-the-command-line"/>
+      <w:bookmarkEnd w:id="100019"/>
+      <w:r>
+        <w:t xml:space="preserve">From the command line</w:t>
+      </w:r>
+    </w:p>
+    <w:p>
+      <w:pPr>
+        <w:spacing w:after="160" w:line="259" w:lineRule="auto"/>
+      </w:pPr>
+      <w:r>
+        <w:t xml:space="preserve">Every App Store entry can also be installed from a terminal, which is handy on a machine you reach over SSH or set up from a script. The command takes the app's id — the same names the store uses:</w:t>
+      </w:r>
+    </w:p>
+    <w:p>
+      <w:pPr>
+        <w:pStyle w:val="Code"/>
+        <w:shd w:val="clear" w:color="auto" w:fill="F3F4F6"/>
+        <w:spacing w:before="120" w:after="120" w:line="252" w:lineRule="auto"/>
+        <w:ind w:left="200" w:right="200"/>
+        <w:contextualSpacing/>
+      </w:pPr>
+      <w:r>
+        <w:t xml:space="preserve">app-install chrome</w:t>
+      </w:r>
+    </w:p>
+    <w:p>
+      <w:pPr>
+        <w:pStyle w:val="Code"/>
+        <w:shd w:val="clear" w:color="auto" w:fill="F3F4F6"/>
+        <w:spacing w:before="120" w:after="120" w:line="252" w:lineRule="auto"/>
+        <w:ind w:left="200" w:right="200"/>
+        <w:contextualSpacing/>
+      </w:pPr>
+      <w:r>
+        <w:t xml:space="preserve">app-install vscode</w:t>
+      </w:r>
+    </w:p>
+    <w:p>
+      <w:pPr>
+        <w:spacing w:after="160" w:line="259" w:lineRule="auto"/>
+      </w:pPr>
+      <w:r>
+        <w:t xml:space="preserve">It installs the same way the store does, writes the app's record so the Launchpad and </w:t>
+      </w:r>
+      <w:hyperlink w:anchor="the-dock">
+        <w:r>
+          <w:rPr>
+            <w:rStyle w:val="Hyperlink"/>
+          </w:rPr>
+          <w:t xml:space="preserve">dock</w:t>
+        </w:r>
+      </w:hyperlink>
+      <w:r>
+        <w:t xml:space="preserve"> pick it up at once, and prints what it did. No relogin is needed.</w:t>
+      </w:r>
+    </w:p>
+    <w:p>
+      <w:pPr>
+        <w:pStyle w:val="Heading3"/>
+        <w:keepNext/>
+        <w:keepLines/>
+        <w:spacing w:before="280" w:after="80" w:line="281" w:lineRule="auto"/>
+      </w:pPr>
+      <w:bookmarkStart w:id="100020" w:name="with-your-distribution-s-packaging"/>
+      <w:bookmarkEnd w:id="100020"/>
       <w:r>
         <w:t xml:space="preserve">With your distribution's packaging</w:t>
       </w:r>
@@ -2668,7 +3688,67 @@
         <w:t xml:space="preserve">.deb</w:t>
       </w:r>
       <w:r>
-        <w:t xml:space="preserve">, a Snap or Flatpak — is a native Linux app, and Starling will run it as a Wayland client (or through the in-tree X server for X11 apps). The major toolkits composite today: Chromium/Electron, Qt6, GTK3 and GTK4.</w:t>
+        <w:t xml:space="preserve">, a Snap or Flatpak — is a native Linux app, and Starling will run it as a Wayland client (or through the in-tree X server for X11 apps):</w:t>
+      </w:r>
+    </w:p>
+    <w:p>
+      <w:pPr>
+        <w:pStyle w:val="Code"/>
+        <w:shd w:val="clear" w:color="auto" w:fill="F3F4F6"/>
+        <w:spacing w:before="120" w:after="120" w:line="252" w:lineRule="auto"/>
+        <w:ind w:left="200" w:right="200"/>
+        <w:contextualSpacing/>
+      </w:pPr>
+      <w:r>
+        <w:t xml:space="preserve">sudo apt install gimp</w:t>
+      </w:r>
+    </w:p>
+    <w:p>
+      <w:pPr>
+        <w:spacing w:after="160" w:line="259" w:lineRule="auto"/>
+      </w:pPr>
+      <w:r>
+        <w:t xml:space="preserve">The major toolkits composite today: Chromium/Electron, Qt6, GTK3 and GTK4.</w:t>
+      </w:r>
+    </w:p>
+    <w:p>
+      <w:pPr>
+        <w:pStyle w:val="Quote"/>
+        <w:pBdr>
+          <w:left w:val="single" w:sz="24" w:space="14" w:color="C8102E"/>
+        </w:pBdr>
+        <w:spacing w:before="160" w:after="200" w:line="281" w:lineRule="auto"/>
+        <w:ind w:left="600" w:right="600"/>
+      </w:pPr>
+      <w:r>
+        <w:rPr>
+          <w:b/>
+          <w:bCs/>
+        </w:rPr>
+        <w:t xml:space="preserve">Note.</w:t>
+      </w:r>
+      <w:r>
+        <w:t xml:space="preserve"> Whichever way an app arrives, it appears in the </w:t>
+      </w:r>
+      <w:hyperlink w:anchor="the-launchpad">
+        <w:r>
+          <w:rPr>
+            <w:rStyle w:val="Hyperlink"/>
+          </w:rPr>
+          <w:t xml:space="preserve">Launchpad</w:t>
+        </w:r>
+      </w:hyperlink>
+      <w:r>
+        <w:t xml:space="preserve"> under the name in its </w:t>
+      </w:r>
+      <w:r>
+        <w:rPr>
+          <w:rFonts w:ascii="Liberation Mono" w:hAnsi="Liberation Mono" w:cs="Liberation Mono"/>
+        </w:rPr>
+        <w:t xml:space="preserve">.desktop</w:t>
+      </w:r>
+      <w:r>
+        <w:t xml:space="preserve"> entry, and keeps its own icon where it ships one.</w:t>
       </w:r>
     </w:p>
     <w:p>
@@ -2682,6 +3762,8 @@
         </w:pBdr>
         <w:spacing w:before="560" w:after="200" w:line="281" w:lineRule="auto"/>
       </w:pPr>
+      <w:bookmarkStart w:id="100021" w:name="workspaces-a-desktop-for-your-agent"/>
+      <w:bookmarkEnd w:id="100021"/>
       <w:r>
         <w:t xml:space="preserve">Workspaces — a desktop for your agent</w:t>
       </w:r>
@@ -2773,10 +3855,233 @@
     </w:p>
     <w:p>
       <w:pPr>
-        <w:spacing w:after="160" w:line="259" w:lineRule="auto"/>
-      </w:pPr>
-      <w:r>
-        <w:t xml:space="preserve">Working the room:</w:t>
+        <w:pStyle w:val="Heading3"/>
+        <w:keepNext/>
+        <w:keepLines/>
+        <w:spacing w:before="280" w:after="80" w:line="281" w:lineRule="auto"/>
+      </w:pPr>
+      <w:bookmarkStart w:id="100022" w:name="handing-a-task-to-an-agent"/>
+      <w:bookmarkEnd w:id="100022"/>
+      <w:r>
+        <w:t xml:space="preserve">Handing a task to an agent</w:t>
+      </w:r>
+    </w:p>
+    <w:p>
+      <w:pPr>
+        <w:numPr>
+          <w:ilvl w:val="0"/>
+          <w:numId w:val="5"/>
+        </w:numPr>
+        <w:spacing w:after="160" w:line="259" w:lineRule="auto"/>
+      </w:pPr>
+      <w:r>
+        <w:t xml:space="preserve">Press </w:t>
+      </w:r>
+      <w:r>
+        <w:rPr>
+          <w:b/>
+          <w:bCs/>
+        </w:rPr>
+        <w:t xml:space="preserve">Ctrl + ↓</w:t>
+      </w:r>
+      <w:r>
+        <w:t xml:space="preserve">. The room opens on the monitor the pointer is on.</w:t>
+      </w:r>
+    </w:p>
+    <w:p>
+      <w:pPr>
+        <w:numPr>
+          <w:ilvl w:val="0"/>
+          <w:numId w:val="5"/>
+        </w:numPr>
+        <w:spacing w:after="160" w:line="259" w:lineRule="auto"/>
+      </w:pPr>
+      <w:r>
+        <w:t xml:space="preserve">Click </w:t>
+      </w:r>
+      <w:r>
+        <w:rPr>
+          <w:b/>
+          <w:bCs/>
+        </w:rPr>
+        <w:t xml:space="preserve">+ New</w:t>
+      </w:r>
+      <w:r>
+        <w:t xml:space="preserve"> at the top of the list, type a name for the workspace and press </w:t>
+      </w:r>
+      <w:r>
+        <w:rPr>
+          <w:b/>
+          <w:bCs/>
+        </w:rPr>
+        <w:t xml:space="preserve">Enter</w:t>
+      </w:r>
+      <w:r>
+        <w:t xml:space="preserve">.</w:t>
+      </w:r>
+    </w:p>
+    <w:p>
+      <w:pPr>
+        <w:numPr>
+          <w:ilvl w:val="0"/>
+          <w:numId w:val="5"/>
+        </w:numPr>
+        <w:spacing w:after="160" w:line="259" w:lineRule="auto"/>
+      </w:pPr>
+      <w:r>
+        <w:t xml:space="preserve">The empty room asks </w:t>
+      </w:r>
+      <w:r>
+        <w:rPr>
+          <w:b/>
+          <w:bCs/>
+        </w:rPr>
+        <w:t xml:space="preserve">Choose an app to work in</w:t>
+      </w:r>
+      <w:r>
+        <w:t xml:space="preserve"> — pick </w:t>
+      </w:r>
+      <w:r>
+        <w:rPr>
+          <w:b/>
+          <w:bCs/>
+        </w:rPr>
+        <w:t xml:space="preserve">Terminal</w:t>
+      </w:r>
+      <w:r>
+        <w:t xml:space="preserve">. It becomes the driver, running down the middle.</w:t>
+      </w:r>
+    </w:p>
+    <w:p>
+      <w:pPr>
+        <w:numPr>
+          <w:ilvl w:val="0"/>
+          <w:numId w:val="5"/>
+        </w:numPr>
+        <w:spacing w:after="160" w:line="259" w:lineRule="auto"/>
+      </w:pPr>
+      <w:r>
+        <w:t xml:space="preserve">In that terminal, go to the project and start the agent.</w:t>
+      </w:r>
+    </w:p>
+    <w:p>
+      <w:pPr>
+        <w:numPr>
+          <w:ilvl w:val="0"/>
+          <w:numId w:val="5"/>
+        </w:numPr>
+        <w:spacing w:after="160" w:line="259" w:lineRule="auto"/>
+      </w:pPr>
+      <w:r>
+        <w:t xml:space="preserve">Hand it the task. Each window the agent opens — a browser to read docs, an editor, a document — lands as a tab on the right, never on your desktop.</w:t>
+      </w:r>
+    </w:p>
+    <w:p>
+      <w:pPr>
+        <w:numPr>
+          <w:ilvl w:val="0"/>
+          <w:numId w:val="5"/>
+        </w:numPr>
+        <w:spacing w:after="160" w:line="259" w:lineRule="auto"/>
+      </w:pPr>
+      <w:r>
+        <w:t xml:space="preserve">Press </w:t>
+      </w:r>
+      <w:r>
+        <w:rPr>
+          <w:b/>
+          <w:bCs/>
+        </w:rPr>
+        <w:t xml:space="preserve">Ctrl + ↓</w:t>
+      </w:r>
+      <w:r>
+        <w:t xml:space="preserve"> again to step back out and carry on with your own work; the agent keeps running. The same key leads back in.</w:t>
+      </w:r>
+    </w:p>
+    <w:p>
+      <w:pPr>
+        <w:spacing w:after="160" w:line="259" w:lineRule="auto"/>
+      </w:pPr>
+      <w:r>
+        <w:t xml:space="preserve">Step 4, for a coding agent that runs in the terminal, is two lines:</w:t>
+      </w:r>
+    </w:p>
+    <w:p>
+      <w:pPr>
+        <w:pStyle w:val="Code"/>
+        <w:shd w:val="clear" w:color="auto" w:fill="F3F4F6"/>
+        <w:spacing w:before="120" w:after="120" w:line="252" w:lineRule="auto"/>
+        <w:ind w:left="200" w:right="200"/>
+        <w:contextualSpacing/>
+      </w:pPr>
+      <w:r>
+        <w:t xml:space="preserve">cd ~/projects/my-app</w:t>
+      </w:r>
+    </w:p>
+    <w:p>
+      <w:pPr>
+        <w:pStyle w:val="Code"/>
+        <w:shd w:val="clear" w:color="auto" w:fill="F3F4F6"/>
+        <w:spacing w:before="120" w:after="120" w:line="252" w:lineRule="auto"/>
+        <w:ind w:left="200" w:right="200"/>
+        <w:contextualSpacing/>
+      </w:pPr>
+      <w:r>
+        <w:t xml:space="preserve">claude</w:t>
+      </w:r>
+    </w:p>
+    <w:p>
+      <w:pPr>
+        <w:pStyle w:val="Quote"/>
+        <w:pBdr>
+          <w:left w:val="single" w:sz="24" w:space="14" w:color="C8102E"/>
+        </w:pBdr>
+        <w:spacing w:before="160" w:after="200" w:line="281" w:lineRule="auto"/>
+        <w:ind w:left="600" w:right="600"/>
+      </w:pPr>
+      <w:r>
+        <w:rPr>
+          <w:b/>
+          <w:bCs/>
+        </w:rPr>
+        <w:t xml:space="preserve">Tip.</w:t>
+      </w:r>
+      <w:r>
+        <w:t xml:space="preserve"> If the agent takes over a window you need, press </w:t>
+      </w:r>
+      <w:r>
+        <w:rPr>
+          <w:b/>
+          <w:bCs/>
+        </w:rPr>
+        <w:t xml:space="preserve">Esc</w:t>
+      </w:r>
+      <w:r>
+        <w:t xml:space="preserve"> to release it — see </w:t>
+      </w:r>
+      <w:hyperlink w:anchor="keyboard-shortcuts">
+        <w:r>
+          <w:rPr>
+            <w:rStyle w:val="Hyperlink"/>
+          </w:rPr>
+          <w:t xml:space="preserve">Keyboard shortcuts</w:t>
+        </w:r>
+      </w:hyperlink>
+      <w:r>
+        <w:t xml:space="preserve">.</w:t>
+      </w:r>
+    </w:p>
+    <w:p>
+      <w:pPr>
+        <w:pStyle w:val="Heading3"/>
+        <w:keepNext/>
+        <w:keepLines/>
+        <w:spacing w:before="280" w:after="80" w:line="281" w:lineRule="auto"/>
+      </w:pPr>
+      <w:bookmarkStart w:id="100023" w:name="working-the-room"/>
+      <w:bookmarkEnd w:id="100023"/>
+      <w:r>
+        <w:t xml:space="preserve">Working the room</w:t>
       </w:r>
     </w:p>
     <w:p>
@@ -2969,6 +4274,8 @@
         </w:pBdr>
         <w:spacing w:before="560" w:after="200" w:line="281" w:lineRule="auto"/>
       </w:pPr>
+      <w:bookmarkStart w:id="100024" w:name="things-to-know-in-this-release"/>
+      <w:bookmarkEnd w:id="100024"/>
       <w:r>
         <w:t xml:space="preserve">Things to know in this release</w:t>
       </w:r>
@@ -2998,7 +4305,18 @@
         <w:t xml:space="preserve">No screen lock.</w:t>
       </w:r>
       <w:r>
-        <w:t xml:space="preserve"> There is a screensaver (below), but it is decoration: any key or mouse movement dismisses it, with nothing asked. Do not rely on it to secure an unattended machine.</w:t>
+        <w:t xml:space="preserve"> There is a </w:t>
+      </w:r>
+      <w:hyperlink w:anchor="the-screensaver">
+        <w:r>
+          <w:rPr>
+            <w:rStyle w:val="Hyperlink"/>
+          </w:rPr>
+          <w:t xml:space="preserve">screensaver</w:t>
+        </w:r>
+      </w:hyperlink>
+      <w:r>
+        <w:t xml:space="preserve">, but it is decoration: any key or mouse movement dismisses it, with nothing asked. Do not rely on it to secure an unattended machine.</w:t>
       </w:r>
     </w:p>
     <w:p>
@@ -3176,7 +4494,38 @@
         <w:t xml:space="preserve">/tmp/starling-session-&lt;your-uid&gt;.log</w:t>
       </w:r>
       <w:r>
-        <w:t xml:space="preserve">, and issues go to &lt;https://github.com/starling-build/starling/issues&gt;.</w:t>
+        <w:t xml:space="preserve">. The last fifty lines are usually the ones that matter:</w:t>
+      </w:r>
+    </w:p>
+    <w:p>
+      <w:pPr>
+        <w:pStyle w:val="Code"/>
+        <w:shd w:val="clear" w:color="auto" w:fill="F3F4F6"/>
+        <w:spacing w:before="120" w:after="120" w:line="252" w:lineRule="auto"/>
+        <w:ind w:left="200" w:right="200"/>
+        <w:contextualSpacing/>
+      </w:pPr>
+      <w:r>
+        <w:t xml:space="preserve">tail -n 50 /tmp/starling-session-$(id -u).log</w:t>
+      </w:r>
+    </w:p>
+    <w:p>
+      <w:pPr>
+        <w:spacing w:after="160" w:line="259" w:lineRule="auto"/>
+      </w:pPr>
+      <w:r>
+        <w:t xml:space="preserve">Issues go to &lt;https://github.com/starling-build/starling/issues&gt;; attach that log, and for a terminal rendering problem the report described in </w:t>
+      </w:r>
+      <w:hyperlink w:anchor="when-the-terminal-draws-the-wrong-thing">
+        <w:r>
+          <w:rPr>
+            <w:rStyle w:val="Hyperlink"/>
+          </w:rPr>
+          <w:t xml:space="preserve">When the terminal draws the wrong thing</w:t>
+        </w:r>
+      </w:hyperlink>
+      <w:r>
+        <w:t xml:space="preserve">.</w:t>
       </w:r>
     </w:p>
     <w:p>
@@ -3190,6 +4539,8 @@
         </w:pBdr>
         <w:spacing w:before="560" w:after="200" w:line="281" w:lineRule="auto"/>
       </w:pPr>
+      <w:bookmarkStart w:id="100025" w:name="when-the-terminal-draws-the-wrong-thing"/>
+      <w:bookmarkEnd w:id="100025"/>
       <w:r>
         <w:t xml:space="preserve">When the terminal draws the wrong thing</w:t>
       </w:r>
@@ -3225,8 +4576,9 @@
       <w:pPr>
         <w:pStyle w:val="Code"/>
         <w:shd w:val="clear" w:color="auto" w:fill="F3F4F6"/>
-        <w:spacing w:after="0" w:line="252" w:lineRule="auto"/>
+        <w:spacing w:before="120" w:after="120" w:line="252" w:lineRule="auto"/>
         <w:ind w:left="200" w:right="200"/>
+        <w:contextualSpacing/>
       </w:pPr>
       <w:r>
         <w:t xml:space="preserve">starling-terminal-report-20260819-103759.txt</w:t>
@@ -3236,8 +4588,9 @@
       <w:pPr>
         <w:pStyle w:val="Code"/>
         <w:shd w:val="clear" w:color="auto" w:fill="F3F4F6"/>
-        <w:spacing w:after="0" w:line="252" w:lineRule="auto"/>
+        <w:spacing w:before="120" w:after="120" w:line="252" w:lineRule="auto"/>
         <w:ind w:left="200" w:right="200"/>
+        <w:contextualSpacing/>
       </w:pPr>
       <w:r>
         <w:t xml:space="preserve">starling-terminal-report-20260819-103759.png</w:t>
@@ -3309,43 +4662,57 @@
         <w:spacing w:after="160" w:line="259" w:lineRule="auto"/>
       </w:pPr>
       <w:r>
-        <w:t xml:space="preserve">One thing worth trying first, and worth saying in the issue either way: start the terminal with </w:t>
-      </w:r>
-      <w:r>
-        <w:rPr>
-          <w:rFonts w:ascii="Liberation Mono" w:hAnsi="Liberation Mono" w:cs="Liberation Mono"/>
-        </w:rPr>
-        <w:t xml:space="preserve">STARLING</w:t>
-      </w:r>
-      <w:r>
-        <w:rPr>
-          <w:rFonts w:ascii="Liberation Mono" w:hAnsi="Liberation Mono" w:cs="Liberation Mono"/>
+        <w:t xml:space="preserve">One thing worth trying first, and worth saying in the issue either way: start the terminal with the atlas painter off:</w:t>
+      </w:r>
+    </w:p>
+    <w:p>
+      <w:pPr>
+        <w:pStyle w:val="Code"/>
+        <w:shd w:val="clear" w:color="auto" w:fill="F3F4F6"/>
+        <w:spacing w:before="120" w:after="120" w:line="252" w:lineRule="auto"/>
+        <w:ind w:left="200" w:right="200"/>
+        <w:contextualSpacing/>
+      </w:pPr>
+      <w:r>
+        <w:t xml:space="preserve">STARLING_TERM_ATLAS=0</w:t>
+      </w:r>
+    </w:p>
+    <w:p>
+      <w:pPr>
+        <w:spacing w:after="160" w:line="259" w:lineRule="auto"/>
+      </w:pPr>
+      <w:r>
+        <w:t xml:space="preserve">That swaps the whole glyph-drawing path for an older one kept for exactly this comparison. If it fixes what you are seeing, that halves the search.</w:t>
+      </w:r>
+    </w:p>
+    <w:p>
+      <w:pPr>
+        <w:pageBreakBefore/>
+        <w:spacing w:after="160" w:line="259" w:lineRule="auto"/>
+      </w:pPr>
+      <w:r>
+        <w:rPr>
           <w:i/>
           <w:iCs/>
         </w:rPr>
-        <w:t xml:space="preserve">TERM</w:t>
-      </w:r>
-      <w:r>
-        <w:rPr>
-          <w:rFonts w:ascii="Liberation Mono" w:hAnsi="Liberation Mono" w:cs="Liberation Mono"/>
-        </w:rPr>
-        <w:t xml:space="preserve">ATLAS=0</w:t>
-      </w:r>
-      <w:r>
-        <w:t xml:space="preserve">. That swaps the whole glyph-drawing path for an older one kept for exactly this comparison. If it fixes what you are seeing, that halves the search.</w:t>
-      </w:r>
-    </w:p>
-    <w:p>
-      <w:pPr>
-        <w:pageBreakBefore/>
-        <w:spacing w:after="160" w:line="259" w:lineRule="auto"/>
-      </w:pPr>
+        <w:t xml:space="preserve">See also: </w:t>
+      </w:r>
+      <w:hyperlink w:anchor="things-to-know-in-this-release">
+        <w:r>
+          <w:rPr>
+            <w:rStyle w:val="Hyperlink"/>
+            <w:i/>
+            <w:iCs/>
+          </w:rPr>
+          <w:t xml:space="preserve">Things to know in this release</w:t>
+        </w:r>
+      </w:hyperlink>
       <w:r>
         <w:rPr>
           <w:i/>
           <w:iCs/>
         </w:rPr>
-        <w:t xml:space="preserve">See also: the Installation Guide, and the project </w:t>
+        <w:t xml:space="preserve">, and the project </w:t>
       </w:r>
       <w:hyperlink r:id="rIdLink2">
         <w:r>
@@ -3679,6 +5046,174 @@
       </w:pPr>
     </w:lvl>
   </w:abstractNum>
+  <w:abstractNum w:abstractNumId="5">
+    <w:multiLevelType w:val="hybridMultilevel"/>
+    <w:lvl w:ilvl="0">
+      <w:start w:val="1"/>
+      <w:numFmt w:val="decimal"/>
+      <w:lvlText w:val="%1."/>
+      <w:lvlJc w:val="left"/>
+      <w:pPr>
+        <w:ind w:left="720" w:hanging="360"/>
+      </w:pPr>
+    </w:lvl>
+    <w:lvl w:ilvl="1">
+      <w:start w:val="1"/>
+      <w:numFmt w:val="decimal"/>
+      <w:lvlText w:val="%2."/>
+      <w:lvlJc w:val="left"/>
+      <w:pPr>
+        <w:ind w:left="1440" w:hanging="360"/>
+      </w:pPr>
+    </w:lvl>
+    <w:lvl w:ilvl="2">
+      <w:start w:val="1"/>
+      <w:numFmt w:val="decimal"/>
+      <w:lvlText w:val="%3."/>
+      <w:lvlJc w:val="left"/>
+      <w:pPr>
+        <w:ind w:left="2160" w:hanging="360"/>
+      </w:pPr>
+    </w:lvl>
+    <w:lvl w:ilvl="3">
+      <w:start w:val="1"/>
+      <w:numFmt w:val="decimal"/>
+      <w:lvlText w:val="%4."/>
+      <w:lvlJc w:val="left"/>
+      <w:pPr>
+        <w:ind w:left="2880" w:hanging="360"/>
+      </w:pPr>
+    </w:lvl>
+    <w:lvl w:ilvl="4">
+      <w:start w:val="1"/>
+      <w:numFmt w:val="decimal"/>
+      <w:lvlText w:val="%5."/>
+      <w:lvlJc w:val="left"/>
+      <w:pPr>
+        <w:ind w:left="3600" w:hanging="360"/>
+      </w:pPr>
+    </w:lvl>
+    <w:lvl w:ilvl="5">
+      <w:start w:val="1"/>
+      <w:numFmt w:val="decimal"/>
+      <w:lvlText w:val="%6."/>
+      <w:lvlJc w:val="left"/>
+      <w:pPr>
+        <w:ind w:left="4320" w:hanging="360"/>
+      </w:pPr>
+    </w:lvl>
+    <w:lvl w:ilvl="6">
+      <w:start w:val="1"/>
+      <w:numFmt w:val="decimal"/>
+      <w:lvlText w:val="%7."/>
+      <w:lvlJc w:val="left"/>
+      <w:pPr>
+        <w:ind w:left="5040" w:hanging="360"/>
+      </w:pPr>
+    </w:lvl>
+    <w:lvl w:ilvl="7">
+      <w:start w:val="1"/>
+      <w:numFmt w:val="decimal"/>
+      <w:lvlText w:val="%8."/>
+      <w:lvlJc w:val="left"/>
+      <w:pPr>
+        <w:ind w:left="5760" w:hanging="360"/>
+      </w:pPr>
+    </w:lvl>
+    <w:lvl w:ilvl="8">
+      <w:start w:val="1"/>
+      <w:numFmt w:val="decimal"/>
+      <w:lvlText w:val="%9."/>
+      <w:lvlJc w:val="left"/>
+      <w:pPr>
+        <w:ind w:left="6480" w:hanging="360"/>
+      </w:pPr>
+    </w:lvl>
+  </w:abstractNum>
+  <w:abstractNum w:abstractNumId="6">
+    <w:multiLevelType w:val="hybridMultilevel"/>
+    <w:lvl w:ilvl="0">
+      <w:start w:val="1"/>
+      <w:numFmt w:val="decimal"/>
+      <w:lvlText w:val="%1."/>
+      <w:lvlJc w:val="left"/>
+      <w:pPr>
+        <w:ind w:left="720" w:hanging="360"/>
+      </w:pPr>
+    </w:lvl>
+    <w:lvl w:ilvl="1">
+      <w:start w:val="1"/>
+      <w:numFmt w:val="decimal"/>
+      <w:lvlText w:val="%2."/>
+      <w:lvlJc w:val="left"/>
+      <w:pPr>
+        <w:ind w:left="1440" w:hanging="360"/>
+      </w:pPr>
+    </w:lvl>
+    <w:lvl w:ilvl="2">
+      <w:start w:val="1"/>
+      <w:numFmt w:val="decimal"/>
+      <w:lvlText w:val="%3."/>
+      <w:lvlJc w:val="left"/>
+      <w:pPr>
+        <w:ind w:left="2160" w:hanging="360"/>
+      </w:pPr>
+    </w:lvl>
+    <w:lvl w:ilvl="3">
+      <w:start w:val="1"/>
+      <w:numFmt w:val="decimal"/>
+      <w:lvlText w:val="%4."/>
+      <w:lvlJc w:val="left"/>
+      <w:pPr>
+        <w:ind w:left="2880" w:hanging="360"/>
+      </w:pPr>
+    </w:lvl>
+    <w:lvl w:ilvl="4">
+      <w:start w:val="1"/>
+      <w:numFmt w:val="decimal"/>
+      <w:lvlText w:val="%5."/>
+      <w:lvlJc w:val="left"/>
+      <w:pPr>
+        <w:ind w:left="3600" w:hanging="360"/>
+      </w:pPr>
+    </w:lvl>
+    <w:lvl w:ilvl="5">
+      <w:start w:val="1"/>
+      <w:numFmt w:val="decimal"/>
+      <w:lvlText w:val="%6."/>
+      <w:lvlJc w:val="left"/>
+      <w:pPr>
+        <w:ind w:left="4320" w:hanging="360"/>
+      </w:pPr>
+    </w:lvl>
+    <w:lvl w:ilvl="6">
+      <w:start w:val="1"/>
+      <w:numFmt w:val="decimal"/>
+      <w:lvlText w:val="%7."/>
+      <w:lvlJc w:val="left"/>
+      <w:pPr>
+        <w:ind w:left="5040" w:hanging="360"/>
+      </w:pPr>
+    </w:lvl>
+    <w:lvl w:ilvl="7">
+      <w:start w:val="1"/>
+      <w:numFmt w:val="decimal"/>
+      <w:lvlText w:val="%8."/>
+      <w:lvlJc w:val="left"/>
+      <w:pPr>
+        <w:ind w:left="5760" w:hanging="360"/>
+      </w:pPr>
+    </w:lvl>
+    <w:lvl w:ilvl="8">
+      <w:start w:val="1"/>
+      <w:numFmt w:val="decimal"/>
+      <w:lvlText w:val="%9."/>
+      <w:lvlJc w:val="left"/>
+      <w:pPr>
+        <w:ind w:left="6480" w:hanging="360"/>
+      </w:pPr>
+    </w:lvl>
+  </w:abstractNum>
   <w:num w:numId="1">
     <w:abstractNumId w:val="0"/>
   </w:num>
@@ -3687,6 +5222,12 @@
   </w:num>
   <w:num w:numId="3">
     <w:abstractNumId w:val="4"/>
+  </w:num>
+  <w:num w:numId="4">
+    <w:abstractNumId w:val="5"/>
+  </w:num>
+  <w:num w:numId="5">
+    <w:abstractNumId w:val="6"/>
   </w:num>
 </w:numbering>
 </file>
@@ -3904,7 +5445,7 @@
     <w:qFormat/>
     <w:pPr>
       <w:shd w:val="clear" w:color="auto" w:fill="F3F4F6"/>
-      <w:spacing w:after="0" w:line="252" w:lineRule="auto"/>
+      <w:spacing w:before="120" w:after="120" w:line="252" w:lineRule="auto"/>
       <w:ind w:left="200" w:right="200"/>
     </w:pPr>
     <w:rPr>

</xml_diff>